<commit_message>
Update governance document: reflect recent policy changes
</commit_message>
<xml_diff>
--- a/GOVERNANCE_SCOPE.docx
+++ b/GOVERNANCE_SCOPE.docx
@@ -7,12 +7,12 @@
         <w:pStyle w:val="Title"/>
       </w:pPr>
       <w:r>
-        <w:t>AI Governance Platform — Workflow &amp; Expansion Scope</w:t>
+        <w:t>AI Governance Platform — Business Overview</w:t>
       </w:r>
     </w:p>
     <w:p>
       <w:r>
-        <w:t xml:space="preserve">Combined reference document. </w:t>
+        <w:t xml:space="preserve">This document explains, in plain terms, what the AI Governance Platform does today and what is being proposed next. </w:t>
       </w:r>
       <w:r>
         <w:rPr>
@@ -21,17 +21,7 @@
         <w:t>Part 1</w:t>
       </w:r>
       <w:r>
-        <w:t xml:space="preserve"> is the ground-truth technical account of how the AI Governance Proxy handles a live request today, based on the current code in </w:t>
-      </w:r>
-      <w:r>
-        <w:rPr>
-          <w:rFonts w:ascii="Consolas" w:hAnsi="Consolas"/>
-          <w:sz w:val="19"/>
-        </w:rPr>
-        <w:t>app/routers/proxy.py</w:t>
-      </w:r>
-      <w:r>
-        <w:t xml:space="preserve"> and the services it calls — including gaps between what is implemented and what is actually enforced. </w:t>
+        <w:t xml:space="preserve"> describes how the platform protects and controls AI usage right now, for every request that flows through it. </w:t>
       </w:r>
       <w:r>
         <w:rPr>
@@ -40,7 +30,7 @@
         <w:t>Part 2</w:t>
       </w:r>
       <w:r>
-        <w:t xml:space="preserve"> lays out proposed expansion features, each with a plain-English scenario and 4-5 concrete build approaches for the engineering team to evaluate.</w:t>
+        <w:t xml:space="preserve"> describes proposed new capabilities, illustrated through a simple example company, along with what each would take to build. No technical background is required to read this document.</w:t>
       </w:r>
     </w:p>
     <w:p>
@@ -48,12 +38,17 @@
         <w:pStyle w:val="Heading1"/>
       </w:pPr>
       <w:r>
-        <w:t>Part 1 — What the Platform Already Does</w:t>
+        <w:t>Part 1 — How the Platform Works Today</w:t>
       </w:r>
     </w:p>
     <w:p>
       <w:r>
-        <w:t>Quick-reference snapshot before the detailed walkthrough below:</w:t>
+        <w:t>Every AI request made by any team is routed through this platform before it reaches the underlying AI service. Think of it as a checkpoint: nothing gets through without being checked for who sent it, whether it's allowed, whether it's within budget, and whether it contains information that shouldn't leave the building. Here is the current state of that checkpoint.</w:t>
+      </w:r>
+    </w:p>
+    <w:p>
+      <w:r>
+        <w:t>Quick snapshot:</w:t>
       </w:r>
     </w:p>
     <w:tbl>
@@ -135,7 +130,7 @@
           <w:p>
             <w:r/>
             <w:r>
-              <w:t>AI Request Gateway</w:t>
+              <w:t>Central checkpoint for all AI traffic</w:t>
             </w:r>
           </w:p>
         </w:tc>
@@ -157,7 +152,7 @@
           <w:p>
             <w:r/>
             <w:r>
-              <w:t>Every AI call from a team is routed through the platform, which checks policy before forwarding it to the provider.</w:t>
+              <w:t>Every AI request from any team is routed through the platform, which checks policy before it reaches the AI provider.</w:t>
             </w:r>
           </w:p>
         </w:tc>
@@ -170,7 +165,7 @@
           <w:p>
             <w:r/>
             <w:r>
-              <w:t>Rate Limiting</w:t>
+              <w:t>Usage speed limits</w:t>
             </w:r>
           </w:p>
         </w:tc>
@@ -192,7 +187,7 @@
           <w:p>
             <w:r/>
             <w:r>
-              <w:t>Caps how many requests or tokens a key, project, or org can use per minute/day.</w:t>
+              <w:t>Caps how many requests or how much usage a team can generate per minute or per day.</w:t>
             </w:r>
           </w:p>
         </w:tc>
@@ -205,7 +200,7 @@
           <w:p>
             <w:r/>
             <w:r>
-              <w:t>Budget Enforcement</w:t>
+              <w:t>Monthly spending limits</w:t>
             </w:r>
           </w:p>
         </w:tc>
@@ -227,7 +222,7 @@
           <w:p>
             <w:r/>
             <w:r>
-              <w:t>Blocks or warns when a project/org's monthly AI spend crosses a set limit.</w:t>
+              <w:t>Warns or blocks a team once their project or organization's monthly AI spend crosses an agreed limit.</w:t>
             </w:r>
           </w:p>
         </w:tc>
@@ -240,7 +235,7 @@
           <w:p>
             <w:r/>
             <w:r>
-              <w:t>Sensitive-Data Detection &amp; Masking</w:t>
+              <w:t>Sensitive-data detection &amp; masking</w:t>
             </w:r>
           </w:p>
         </w:tc>
@@ -262,7 +257,7 @@
           <w:p>
             <w:r/>
             <w:r>
-              <w:t>Scans requests for emails, IDs, financial data, etc., and masks or blocks them based on policy.</w:t>
+              <w:t>Scans every request for personal or sensitive information and masks, blocks, or flags it according to policy.</w:t>
             </w:r>
           </w:p>
         </w:tc>
@@ -275,7 +270,7 @@
           <w:p>
             <w:r/>
             <w:r>
-              <w:t>Token &amp; Cost Tracking</w:t>
+              <w:t>Usage &amp; cost tracking</w:t>
             </w:r>
           </w:p>
         </w:tc>
@@ -297,7 +292,7 @@
           <w:p>
             <w:r/>
             <w:r>
-              <w:t>Counts tokens per request and calculates cost using current model pricing.</w:t>
+              <w:t>Counts exactly how much AI capacity each request used and calculates its cost.</w:t>
             </w:r>
           </w:p>
         </w:tc>
@@ -310,7 +305,7 @@
           <w:p>
             <w:r/>
             <w:r>
-              <w:t>Per-Project / Per-User Usage Tracking</w:t>
+              <w:t>Per-team and per-person usage tracking</w:t>
             </w:r>
           </w:p>
         </w:tc>
@@ -332,7 +327,7 @@
           <w:p>
             <w:r/>
             <w:r>
-              <w:t>Usage and cost are broken down by individual project and user, not just the org as a whole.</w:t>
+              <w:t>Usage and cost are broken down by individual project and individual person, not just the organization as a whole.</w:t>
             </w:r>
           </w:p>
         </w:tc>
@@ -345,7 +340,7 @@
           <w:p>
             <w:r/>
             <w:r>
-              <w:t>Cost Dashboards</w:t>
+              <w:t>Cost dashboards</w:t>
             </w:r>
           </w:p>
         </w:tc>
@@ -367,7 +362,7 @@
           <w:p>
             <w:r/>
             <w:r>
-              <w:t>Reporting by model, project, org, and time trend.</w:t>
+              <w:t>Reporting by AI model, project, organization, and trend over time.</w:t>
             </w:r>
           </w:p>
         </w:tc>
@@ -380,7 +375,7 @@
           <w:p>
             <w:r/>
             <w:r>
-              <w:t>Audit Trail &amp; Alerts</w:t>
+              <w:t>Audit trail &amp; alerts</w:t>
             </w:r>
           </w:p>
         </w:tc>
@@ -402,7 +397,7 @@
           <w:p>
             <w:r/>
             <w:r>
-              <w:t>Every policy decision is logged; violations raise alerts.</w:t>
+              <w:t>Every decision the platform makes is permanently logged; policy violations raise alerts automatically.</w:t>
             </w:r>
           </w:p>
         </w:tc>
@@ -415,7 +410,7 @@
           <w:p>
             <w:r/>
             <w:r>
-              <w:t>Scheduled Rollups</w:t>
+              <w:t>Automatic scheduled reporting</w:t>
             </w:r>
           </w:p>
         </w:tc>
@@ -437,7 +432,7 @@
           <w:p>
             <w:r/>
             <w:r>
-              <w:t>Usage is automatically summarized hourly, daily, and monthly.</w:t>
+              <w:t>Usage figures are automatically summarized every hour, every day, and every month.</w:t>
             </w:r>
           </w:p>
         </w:tc>
@@ -450,7 +445,7 @@
           <w:p>
             <w:r/>
             <w:r>
-              <w:t>Multi-Provider Framework</w:t>
+              <w:t>Support for multiple AI providers</w:t>
             </w:r>
           </w:p>
         </w:tc>
@@ -472,7 +467,7 @@
           <w:p>
             <w:r/>
             <w:r>
-              <w:t>Groundwork exists to ingest usage from providers beyond the current one, not yet complete.</w:t>
+              <w:t>The groundwork exists to bring in usage from additional AI providers beyond the current one; not yet complete.</w:t>
             </w:r>
           </w:p>
         </w:tc>
@@ -485,7 +480,7 @@
           <w:p>
             <w:r/>
             <w:r>
-              <w:t>Model Allow/Block Rules</w:t>
+              <w:t>Model restriction rules</w:t>
             </w:r>
           </w:p>
         </w:tc>
@@ -496,7 +491,7 @@
           <w:p>
             <w:r/>
             <w:r>
-              <w:t>Built but inactive</w:t>
+              <w:t>Built, not yet active</w:t>
             </w:r>
           </w:p>
         </w:tc>
@@ -507,7 +502,7 @@
           <w:p>
             <w:r/>
             <w:r>
-              <w:t>Rules to restrict specific models exist but aren't yet enforced on live traffic.</w:t>
+              <w:t>Rules to allow or block specific AI models exist in the system but are not yet enforced on live traffic — see Section 6.</w:t>
             </w:r>
           </w:p>
         </w:tc>
@@ -520,7 +515,7 @@
           <w:p>
             <w:r/>
             <w:r>
-              <w:t>Optimization Tips</w:t>
+              <w:t>Optimization recommendations</w:t>
             </w:r>
           </w:p>
         </w:tc>
@@ -542,7 +537,7 @@
           <w:p>
             <w:r/>
             <w:r>
-              <w:t>—</w:t>
+              <w:t>Proposed — see Part 2.</w:t>
             </w:r>
           </w:p>
         </w:tc>
@@ -555,7 +550,7 @@
           <w:p>
             <w:r/>
             <w:r>
-              <w:t>Savings Counter</w:t>
+              <w:t>Savings tracker</w:t>
             </w:r>
           </w:p>
         </w:tc>
@@ -577,7 +572,7 @@
           <w:p>
             <w:r/>
             <w:r>
-              <w:t>—</w:t>
+              <w:t>Proposed — see Part 2.</w:t>
             </w:r>
           </w:p>
         </w:tc>
@@ -590,7 +585,7 @@
           <w:p>
             <w:r/>
             <w:r>
-              <w:t>Licensed, Expiring Downloadable Package</w:t>
+              <w:t>Licensed, time-limited software packages</w:t>
             </w:r>
           </w:p>
         </w:tc>
@@ -612,325 +607,23 @@
           <w:p>
             <w:r/>
             <w:r>
-              <w:t>—</w:t>
+              <w:t>Proposed — see Part 2.</w:t>
             </w:r>
           </w:p>
         </w:tc>
       </w:tr>
     </w:tbl>
     <w:p>
+      <w:pPr>
+        <w:pStyle w:val="Heading2"/>
+      </w:pPr>
       <w:r>
-        <w:t>The detailed walkthrough below (originally maintained as GOVERNANCE_WORKFLOW.md) traces exactly what happens for a single request, stage by stage, and calls out explicitly where a service is implemented but not actually wired into the live path.</w:t>
+        <w:t>1. What Happens When a Team Sends an AI Request</w:t>
       </w:r>
     </w:p>
     <w:p>
       <w:r>
-        <w:t xml:space="preserve">This document describes what actually happens inside the AI Governance Proxy for a single request, based on the current code in </w:t>
-      </w:r>
-      <w:r>
-        <w:rPr>
-          <w:rFonts w:ascii="Consolas" w:hAnsi="Consolas"/>
-          <w:sz w:val="19"/>
-        </w:rPr>
-        <w:t>app/routers/proxy.py</w:t>
-      </w:r>
-      <w:r>
-        <w:t xml:space="preserve"> and the services it calls. It is meant as a ground-truth reference, not an aspirational spec — where enforcement described in a service module is not actually wired into the live request path, that is called out explicitly.</w:t>
-      </w:r>
-    </w:p>
-    <w:p>
-      <w:pPr>
-        <w:pStyle w:val="Heading2"/>
-      </w:pPr>
-      <w:r>
-        <w:t>1. Entry points</w:t>
-      </w:r>
-    </w:p>
-    <w:p>
-      <w:r>
-        <w:t xml:space="preserve">All traffic goes through </w:t>
-      </w:r>
-      <w:r>
-        <w:rPr>
-          <w:rFonts w:ascii="Consolas" w:hAnsi="Consolas"/>
-          <w:sz w:val="19"/>
-        </w:rPr>
-        <w:t>app/routers/proxy.py</w:t>
-      </w:r>
-      <w:r>
-        <w:t xml:space="preserve">, mounted at </w:t>
-      </w:r>
-      <w:r>
-        <w:rPr>
-          <w:rFonts w:ascii="Consolas" w:hAnsi="Consolas"/>
-          <w:sz w:val="19"/>
-        </w:rPr>
-        <w:t>/proxy</w:t>
-      </w:r>
-      <w:r>
-        <w:t>:</w:t>
-      </w:r>
-    </w:p>
-    <w:tbl>
-      <w:tblPr>
-        <w:tblStyle w:val="LightGrid-Accent1"/>
-        <w:tblW w:type="auto" w:w="0"/>
-        <w:jc w:val="center"/>
-        <w:tblLook w:firstColumn="1" w:firstRow="1" w:lastColumn="0" w:lastRow="0" w:noHBand="0" w:noVBand="1" w:val="04A0"/>
-      </w:tblPr>
-      <w:tblGrid>
-        <w:gridCol w:w="4320"/>
-        <w:gridCol w:w="4320"/>
-      </w:tblGrid>
-      <w:tr>
-        <w:tc>
-          <w:tcPr>
-            <w:tcW w:type="dxa" w:w="4320"/>
-            <w:shd w:val="clear" w:color="auto" w:fill="D9E2F3"/>
-          </w:tcPr>
-          <w:p>
-            <w:r>
-              <w:rPr>
-                <w:b/>
-              </w:rPr>
-            </w:r>
-            <w:r>
-              <w:rPr>
-                <w:b/>
-              </w:rPr>
-              <w:t>Route</w:t>
-            </w:r>
-          </w:p>
-        </w:tc>
-        <w:tc>
-          <w:tcPr>
-            <w:tcW w:type="dxa" w:w="4320"/>
-            <w:shd w:val="clear" w:color="auto" w:fill="D9E2F3"/>
-          </w:tcPr>
-          <w:p>
-            <w:r>
-              <w:rPr>
-                <w:b/>
-              </w:rPr>
-            </w:r>
-            <w:r>
-              <w:rPr>
-                <w:b/>
-              </w:rPr>
-              <w:t>Purpose</w:t>
-            </w:r>
-          </w:p>
-        </w:tc>
-      </w:tr>
-      <w:tr>
-        <w:tc>
-          <w:tcPr>
-            <w:tcW w:type="dxa" w:w="4320"/>
-          </w:tcPr>
-          <w:p>
-            <w:r/>
-            <w:r>
-              <w:rPr>
-                <w:rFonts w:ascii="Consolas" w:hAnsi="Consolas"/>
-                <w:sz w:val="19"/>
-              </w:rPr>
-              <w:t>POST /proxy</w:t>
-            </w:r>
-          </w:p>
-        </w:tc>
-        <w:tc>
-          <w:tcPr>
-            <w:tcW w:type="dxa" w:w="4320"/>
-          </w:tcPr>
-          <w:p>
-            <w:r/>
-            <w:r>
-              <w:t>Canonical non-streaming chat completion endpoint</w:t>
-            </w:r>
-          </w:p>
-        </w:tc>
-      </w:tr>
-      <w:tr>
-        <w:tc>
-          <w:tcPr>
-            <w:tcW w:type="dxa" w:w="4320"/>
-          </w:tcPr>
-          <w:p>
-            <w:r/>
-            <w:r>
-              <w:rPr>
-                <w:rFonts w:ascii="Consolas" w:hAnsi="Consolas"/>
-                <w:sz w:val="19"/>
-              </w:rPr>
-              <w:t>POST /proxy/chat/completions</w:t>
-            </w:r>
-            <w:r>
-              <w:t xml:space="preserve">, </w:t>
-            </w:r>
-            <w:r>
-              <w:rPr>
-                <w:rFonts w:ascii="Consolas" w:hAnsi="Consolas"/>
-                <w:sz w:val="19"/>
-              </w:rPr>
-              <w:t>POST /proxy/v1/chat/completions</w:t>
-            </w:r>
-          </w:p>
-        </w:tc>
-        <w:tc>
-          <w:tcPr>
-            <w:tcW w:type="dxa" w:w="4320"/>
-          </w:tcPr>
-          <w:p>
-            <w:r/>
-            <w:r>
-              <w:t xml:space="preserve">Thin aliases so the OpenAI SDK (which appends </w:t>
-            </w:r>
-            <w:r>
-              <w:rPr>
-                <w:rFonts w:ascii="Consolas" w:hAnsi="Consolas"/>
-                <w:sz w:val="19"/>
-              </w:rPr>
-              <w:t>/chat/completions</w:t>
-            </w:r>
-            <w:r>
-              <w:t xml:space="preserve"> to </w:t>
-            </w:r>
-            <w:r>
-              <w:rPr>
-                <w:rFonts w:ascii="Consolas" w:hAnsi="Consolas"/>
-                <w:sz w:val="19"/>
-              </w:rPr>
-              <w:t>base_url</w:t>
-            </w:r>
-            <w:r>
-              <w:t>) works unmodified</w:t>
-            </w:r>
-          </w:p>
-        </w:tc>
-      </w:tr>
-      <w:tr>
-        <w:tc>
-          <w:tcPr>
-            <w:tcW w:type="dxa" w:w="4320"/>
-          </w:tcPr>
-          <w:p>
-            <w:r/>
-            <w:r>
-              <w:rPr>
-                <w:rFonts w:ascii="Consolas" w:hAnsi="Consolas"/>
-                <w:sz w:val="19"/>
-              </w:rPr>
-              <w:t>POST /proxy/stream</w:t>
-            </w:r>
-          </w:p>
-        </w:tc>
-        <w:tc>
-          <w:tcPr>
-            <w:tcW w:type="dxa" w:w="4320"/>
-          </w:tcPr>
-          <w:p>
-            <w:r/>
-            <w:r>
-              <w:t>SSE streaming variant</w:t>
-            </w:r>
-          </w:p>
-        </w:tc>
-      </w:tr>
-      <w:tr>
-        <w:tc>
-          <w:tcPr>
-            <w:tcW w:type="dxa" w:w="4320"/>
-          </w:tcPr>
-          <w:p>
-            <w:r/>
-            <w:r>
-              <w:rPr>
-                <w:rFonts w:ascii="Consolas" w:hAnsi="Consolas"/>
-                <w:sz w:val="19"/>
-              </w:rPr>
-              <w:t>GET /proxy/stats/*</w:t>
-            </w:r>
-            <w:r>
-              <w:t xml:space="preserve">, </w:t>
-            </w:r>
-            <w:r>
-              <w:rPr>
-                <w:rFonts w:ascii="Consolas" w:hAnsi="Consolas"/>
-                <w:sz w:val="19"/>
-              </w:rPr>
-              <w:t>GET /proxy/v1/requests*</w:t>
-            </w:r>
-          </w:p>
-        </w:tc>
-        <w:tc>
-          <w:tcPr>
-            <w:tcW w:type="dxa" w:w="4320"/>
-          </w:tcPr>
-          <w:p>
-            <w:r/>
-            <w:r>
-              <w:t>Read-only admin/stats endpoints</w:t>
-            </w:r>
-          </w:p>
-        </w:tc>
-      </w:tr>
-    </w:tbl>
-    <w:p>
-      <w:r>
-        <w:t xml:space="preserve">There is no separate embeddings endpoint — every model type goes through the same gateway; deployment resolution is driven by the </w:t>
-      </w:r>
-      <w:r>
-        <w:rPr>
-          <w:rFonts w:ascii="Consolas" w:hAnsi="Consolas"/>
-          <w:sz w:val="19"/>
-        </w:rPr>
-        <w:t>model</w:t>
-      </w:r>
-      <w:r>
-        <w:t xml:space="preserve"> field in the request body, not by the route.</w:t>
-      </w:r>
-    </w:p>
-    <w:p>
-      <w:pPr>
-        <w:pStyle w:val="Heading2"/>
-      </w:pPr>
-      <w:r>
-        <w:t>2. Request pipeline (pre-flight, shared by both chat and stream paths)</w:t>
-      </w:r>
-    </w:p>
-    <w:p>
-      <w:r>
-        <w:t xml:space="preserve">Implemented in </w:t>
-      </w:r>
-      <w:r>
-        <w:rPr>
-          <w:rFonts w:ascii="Consolas" w:hAnsi="Consolas"/>
-          <w:sz w:val="19"/>
-        </w:rPr>
-        <w:t>_run_pre_flight()</w:t>
-      </w:r>
-      <w:r>
-        <w:t xml:space="preserve">. Each stage that blocks the request writes an </w:t>
-      </w:r>
-      <w:r>
-        <w:rPr>
-          <w:rFonts w:ascii="Consolas" w:hAnsi="Consolas"/>
-          <w:sz w:val="19"/>
-        </w:rPr>
-        <w:t>AiRequest</w:t>
-      </w:r>
-      <w:r>
-        <w:t xml:space="preserve"> row with </w:t>
-      </w:r>
-      <w:r>
-        <w:rPr>
-          <w:rFonts w:ascii="Consolas" w:hAnsi="Consolas"/>
-          <w:sz w:val="19"/>
-        </w:rPr>
-        <w:t>request_status="blocked"</w:t>
-      </w:r>
-      <w:r>
-        <w:t xml:space="preserve"> before raising, so blocked traffic is still auditable.</w:t>
+        <w:t>Every single request — whether it's a customer-support chatbot answering a question or an internal tool summarizing a document — goes through the same sequence of checks, in this order, before it reaches the AI provider:</w:t>
       </w:r>
     </w:p>
     <w:p>
@@ -941,50 +634,10 @@
         <w:rPr>
           <w:b/>
         </w:rPr>
-        <w:t>Authenticate</w:t>
+        <w:t>Confirm who is asking.</w:t>
       </w:r>
       <w:r>
-        <w:t xml:space="preserve"> — </w:t>
-      </w:r>
-      <w:r>
-        <w:rPr>
-          <w:rFonts w:ascii="Consolas" w:hAnsi="Consolas"/>
-          <w:sz w:val="19"/>
-        </w:rPr>
-        <w:t>verify_governance_key()</w:t>
-      </w:r>
-      <w:r>
-        <w:t xml:space="preserve"> hashes the </w:t>
-      </w:r>
-      <w:r>
-        <w:rPr>
-          <w:rFonts w:ascii="Consolas" w:hAnsi="Consolas"/>
-          <w:sz w:val="19"/>
-        </w:rPr>
-        <w:t>X-Governance-Key</w:t>
-      </w:r>
-      <w:r>
-        <w:t xml:space="preserve"> header (SHA-256) and looks up an active, non-expired </w:t>
-      </w:r>
-      <w:r>
-        <w:rPr>
-          <w:rFonts w:ascii="Consolas" w:hAnsi="Consolas"/>
-          <w:sz w:val="19"/>
-        </w:rPr>
-        <w:t>ApiKey</w:t>
-      </w:r>
-      <w:r>
-        <w:t xml:space="preserve"> row. Failure → </w:t>
-      </w:r>
-      <w:r>
-        <w:rPr>
-          <w:rFonts w:ascii="Consolas" w:hAnsi="Consolas"/>
-          <w:sz w:val="19"/>
-        </w:rPr>
-        <w:t>401</w:t>
-      </w:r>
-      <w:r>
-        <w:t>, no request row written at all.</w:t>
+        <w:t xml:space="preserve"> The request must present a valid access credential tied to a specific team and project. An invalid or expired credential is rejected immediately, before anything else happens.</w:t>
       </w:r>
     </w:p>
     <w:p>
@@ -995,29 +648,10 @@
         <w:rPr>
           <w:b/>
         </w:rPr>
-        <w:t>Rate limit check</w:t>
+        <w:t>Check the speed limit.</w:t>
       </w:r>
       <w:r>
-        <w:t xml:space="preserve"> — runs *before* the body is parsed, deliberately, as the cheapest gate. See §4. Failure → </w:t>
-      </w:r>
-      <w:r>
-        <w:rPr>
-          <w:rFonts w:ascii="Consolas" w:hAnsi="Consolas"/>
-          <w:sz w:val="19"/>
-        </w:rPr>
-        <w:t>429</w:t>
-      </w:r>
-      <w:r>
-        <w:t xml:space="preserve">. Any non-HTTPException error here is swallowed and logged — </w:t>
-      </w:r>
-      <w:r>
-        <w:rPr>
-          <w:b/>
-        </w:rPr>
-        <w:t>rate limiting fails open</w:t>
-      </w:r>
-      <w:r>
-        <w:t>.</w:t>
+        <w:t xml:space="preserve"> The platform checks whether that team has sent too many requests too quickly, or used too much capacity in the current time window. This is checked first, before the request is even read, because it's the cheapest check to run — it stops obvious misuse before any real cost is incurred.</w:t>
       </w:r>
     </w:p>
     <w:p>
@@ -1028,20 +662,10 @@
         <w:rPr>
           <w:b/>
         </w:rPr>
-        <w:t>Parse JSON body</w:t>
+        <w:t>Read and validate the request.</w:t>
       </w:r>
       <w:r>
-        <w:t xml:space="preserve"> — malformed JSON → </w:t>
-      </w:r>
-      <w:r>
-        <w:rPr>
-          <w:rFonts w:ascii="Consolas" w:hAnsi="Consolas"/>
-          <w:sz w:val="19"/>
-        </w:rPr>
-        <w:t>400</w:t>
-      </w:r>
-      <w:r>
-        <w:t>.</w:t>
+        <w:t xml:space="preserve"> The request is parsed to make sure it's properly formed. A malformed request is rejected with an explanation.</w:t>
       </w:r>
     </w:p>
     <w:p>
@@ -1052,20 +676,10 @@
         <w:rPr>
           <w:b/>
         </w:rPr>
-        <w:t>Resolve model / deployment</w:t>
+        <w:t>Match it to the right AI model.</w:t>
       </w:r>
       <w:r>
-        <w:t xml:space="preserve"> — looks up candidate provider deployments for the requested model name. No match → </w:t>
-      </w:r>
-      <w:r>
-        <w:rPr>
-          <w:rFonts w:ascii="Consolas" w:hAnsi="Consolas"/>
-          <w:sz w:val="19"/>
-        </w:rPr>
-        <w:t>404</w:t>
-      </w:r>
-      <w:r>
-        <w:t>. *(Model allow/block-list rules are not checked here — see §6.)*</w:t>
+        <w:t xml:space="preserve"> The platform identifies which AI model or service the team is configured to use for this type of request.</w:t>
       </w:r>
     </w:p>
     <w:p>
@@ -1076,29 +690,10 @@
         <w:rPr>
           <w:b/>
         </w:rPr>
-        <w:t>Budget check</w:t>
+        <w:t>Check the monthly budget.</w:t>
       </w:r>
       <w:r>
-        <w:t xml:space="preserve"> — see §5. Failure → </w:t>
-      </w:r>
-      <w:r>
-        <w:rPr>
-          <w:rFonts w:ascii="Consolas" w:hAnsi="Consolas"/>
-          <w:sz w:val="19"/>
-        </w:rPr>
-        <w:t>429</w:t>
-      </w:r>
-      <w:r>
-        <w:t xml:space="preserve">. Non-HTTPException errors are swallowed — </w:t>
-      </w:r>
-      <w:r>
-        <w:rPr>
-          <w:b/>
-        </w:rPr>
-        <w:t>budget enforcement fails open</w:t>
-      </w:r>
-      <w:r>
-        <w:t>.</w:t>
+        <w:t xml:space="preserve"> The platform checks the team's project-level spending first, then the wider organization's spending, against agreed monthly limits. Crossing roughly 80% of a budget triggers a warning while the request still proceeds; reaching 100% blocks further requests until the next billing cycle or an approved limit increase.</w:t>
       </w:r>
     </w:p>
     <w:p>
@@ -1109,38 +704,10 @@
         <w:rPr>
           <w:b/>
         </w:rPr>
-        <w:t>PII scan</w:t>
+        <w:t>Scan for sensitive information.</w:t>
       </w:r>
       <w:r>
-        <w:t xml:space="preserve"> — see §7. A block verdict → </w:t>
-      </w:r>
-      <w:r>
-        <w:rPr>
-          <w:rFonts w:ascii="Consolas" w:hAnsi="Consolas"/>
-          <w:sz w:val="19"/>
-        </w:rPr>
-        <w:t>403</w:t>
-      </w:r>
-      <w:r>
-        <w:t xml:space="preserve">. Non-HTTPException errors are swallowed and the </w:t>
-      </w:r>
-      <w:r>
-        <w:rPr>
-          <w:b/>
-        </w:rPr>
-        <w:t>original, unmasked</w:t>
-      </w:r>
-      <w:r>
-        <w:t xml:space="preserve"> messages are forwarded — </w:t>
-      </w:r>
-      <w:r>
-        <w:rPr>
-          <w:b/>
-        </w:rPr>
-        <w:t>PII scanning fails open</w:t>
-      </w:r>
-      <w:r>
-        <w:t>.</w:t>
+        <w:t xml:space="preserve"> Every request is scanned for personal or sensitive data — names, emails, ID numbers, financial details, and similar — before it goes anywhere. Depending on policy, sensitive information is either removed automatically, blocked outright, flagged for review, or allowed through untouched. Policy can be tailored per type of information and per organization.</w:t>
       </w:r>
     </w:p>
     <w:p>
@@ -1151,20 +718,10 @@
         <w:rPr>
           <w:b/>
         </w:rPr>
-        <w:t>Store `AiRequest`</w:t>
+        <w:t>Create a permanent record.</w:t>
       </w:r>
       <w:r>
-        <w:t xml:space="preserve"> — writes the row (</w:t>
-      </w:r>
-      <w:r>
-        <w:rPr>
-          <w:rFonts w:ascii="Consolas" w:hAnsi="Consolas"/>
-          <w:sz w:val="19"/>
-        </w:rPr>
-        <w:t>request_status="pending"</w:t>
-      </w:r>
-      <w:r>
-        <w:t>, original + sanitized text, PII metadata) and commits, so the request is durable before it ever reaches the upstream provider.</w:t>
+        <w:t xml:space="preserve"> Whether a request proceeds or is stopped at any of the steps above, it is written to a permanent record first — so nothing that happens is ever invisible after the fact, including requests that get blocked.</w:t>
       </w:r>
     </w:p>
     <w:p>
@@ -1175,10 +732,29 @@
         <w:rPr>
           <w:b/>
         </w:rPr>
-        <w:t>Build outbound attempts</w:t>
+        <w:t>Send it to the AI provider.</w:t>
       </w:r>
       <w:r>
-        <w:t xml:space="preserve"> — one per candidate deployment, primary first, enabling failover without repeating steps 1–7.</w:t>
+        <w:t xml:space="preserve"> The request is forwarded to the AI service. If the provider is briefly unavailable or overloaded, the platform automatically retries and can fail over to a backup option, without the team needing to do anything. A built-in safety limit also caps how many requests can be in flight at once, to protect against overload.</w:t>
+      </w:r>
+    </w:p>
+    <w:p>
+      <w:pPr>
+        <w:pStyle w:val="ListNumber"/>
+      </w:pPr>
+      <w:r>
+        <w:rPr>
+          <w:b/>
+        </w:rPr>
+        <w:t>Calculate and record the cost.</w:t>
+      </w:r>
+      <w:r>
+        <w:t xml:space="preserve"> Once a response comes back, the platform works out exactly how much AI capacity was used and what it cost, using the AI provider's own reported figures whenever available. This bookkeeping happens in the background, after the response has already been delivered — so the requesting team is never kept waiting for it.</w:t>
+      </w:r>
+    </w:p>
+    <w:p>
+      <w:r>
+        <w:t>Live, real-time conversations (where the AI responds progressively rather than all at once) go through the same checks. The one difference is that usage for these is always estimated rather than read directly from the provider, since providers don't reliably report exact figures for that kind of exchange. If a live conversation is interrupted partway through, whatever was actually produced is still recorded and billed for.</w:t>
       </w:r>
     </w:p>
     <w:p>
@@ -1186,1516 +762,7 @@
         <w:pStyle w:val="Heading2"/>
       </w:pPr>
       <w:r>
-        <w:t>3. Forwarding &amp; response handling</w:t>
-      </w:r>
-    </w:p>
-    <w:p>
-      <w:pPr>
-        <w:pStyle w:val="ListBullet"/>
-      </w:pPr>
-      <w:r>
-        <w:t xml:space="preserve">A process-wide concurrency limiter caps simultaneous upstream calls; if full → </w:t>
-      </w:r>
-      <w:r>
-        <w:rPr>
-          <w:rFonts w:ascii="Consolas" w:hAnsi="Consolas"/>
-          <w:sz w:val="19"/>
-        </w:rPr>
-        <w:t>503</w:t>
-      </w:r>
-      <w:r>
-        <w:t xml:space="preserve"> immediately, no cost incurred.</w:t>
-      </w:r>
-    </w:p>
-    <w:p>
-      <w:pPr>
-        <w:pStyle w:val="ListBullet"/>
-      </w:pPr>
-      <w:r>
-        <w:t>The request is forwarded to Azure OpenAI (or other configured provider) with retry-with-backoff on 5xx/connection errors, and failover to the next candidate deployment on 429/5xx/connection errors.</w:t>
-      </w:r>
-    </w:p>
-    <w:p>
-      <w:pPr>
-        <w:pStyle w:val="ListBullet"/>
-      </w:pPr>
-      <w:r>
-        <w:rPr>
-          <w:b/>
-        </w:rPr>
-        <w:t>Azure 429</w:t>
-      </w:r>
-      <w:r>
-        <w:t xml:space="preserve"> → passed through as </w:t>
-      </w:r>
-      <w:r>
-        <w:rPr>
-          <w:rFonts w:ascii="Consolas" w:hAnsi="Consolas"/>
-          <w:sz w:val="19"/>
-        </w:rPr>
-        <w:t>429</w:t>
-      </w:r>
-      <w:r>
-        <w:t xml:space="preserve"> with Azure's own error body; no cost recorded.</w:t>
-      </w:r>
-    </w:p>
-    <w:p>
-      <w:pPr>
-        <w:pStyle w:val="ListBullet"/>
-      </w:pPr>
-      <w:r>
-        <w:rPr>
-          <w:b/>
-        </w:rPr>
-        <w:t>Azure other error</w:t>
-      </w:r>
-      <w:r>
-        <w:t xml:space="preserve"> → passed through with Azure's status code; cost *is* still recorded if Azure's error body includes a </w:t>
-      </w:r>
-      <w:r>
-        <w:rPr>
-          <w:rFonts w:ascii="Consolas" w:hAnsi="Consolas"/>
-          <w:sz w:val="19"/>
-        </w:rPr>
-        <w:t>usage</w:t>
-      </w:r>
-      <w:r>
-        <w:t xml:space="preserve"> field (e.g. content-filter rejections).</w:t>
-      </w:r>
-    </w:p>
-    <w:p>
-      <w:pPr>
-        <w:pStyle w:val="ListBullet"/>
-      </w:pPr>
-      <w:r>
-        <w:rPr>
-          <w:b/>
-        </w:rPr>
-        <w:t>Azure unreachable</w:t>
-      </w:r>
-      <w:r>
-        <w:t xml:space="preserve"> → </w:t>
-      </w:r>
-      <w:r>
-        <w:rPr>
-          <w:rFonts w:ascii="Consolas" w:hAnsi="Consolas"/>
-          <w:sz w:val="19"/>
-        </w:rPr>
-        <w:t>502</w:t>
-      </w:r>
-      <w:r>
-        <w:t>.</w:t>
-      </w:r>
-    </w:p>
-    <w:p>
-      <w:pPr>
-        <w:pStyle w:val="ListBullet"/>
-      </w:pPr>
-      <w:r>
-        <w:rPr>
-          <w:b/>
-        </w:rPr>
-        <w:t>Circuit breaker open</w:t>
-      </w:r>
-      <w:r>
-        <w:t xml:space="preserve"> (repeated upstream failures) → </w:t>
-      </w:r>
-      <w:r>
-        <w:rPr>
-          <w:rFonts w:ascii="Consolas" w:hAnsi="Consolas"/>
-          <w:sz w:val="19"/>
-        </w:rPr>
-        <w:t>503</w:t>
-      </w:r>
-      <w:r>
-        <w:t>.</w:t>
-      </w:r>
-    </w:p>
-    <w:p>
-      <w:pPr>
-        <w:pStyle w:val="ListBullet"/>
-      </w:pPr>
-      <w:r>
-        <w:t xml:space="preserve">On success: token usage is read from Azure's own </w:t>
-      </w:r>
-      <w:r>
-        <w:rPr>
-          <w:rFonts w:ascii="Consolas" w:hAnsi="Consolas"/>
-          <w:sz w:val="19"/>
-        </w:rPr>
-        <w:t>usage</w:t>
-      </w:r>
-      <w:r>
-        <w:t xml:space="preserve"> field when present, falling back to a tiktoken estimate otherwise (see §8). Cost calculation and the </w:t>
-      </w:r>
-      <w:r>
-        <w:rPr>
-          <w:rFonts w:ascii="Consolas" w:hAnsi="Consolas"/>
-          <w:sz w:val="19"/>
-        </w:rPr>
-        <w:t>AiResponse</w:t>
-      </w:r>
-      <w:r>
-        <w:t xml:space="preserve"> / </w:t>
-      </w:r>
-      <w:r>
-        <w:rPr>
-          <w:rFonts w:ascii="Consolas" w:hAnsi="Consolas"/>
-          <w:sz w:val="19"/>
-        </w:rPr>
-        <w:t>TokenUsage</w:t>
-      </w:r>
-      <w:r>
-        <w:t xml:space="preserve"> / </w:t>
-      </w:r>
-      <w:r>
-        <w:rPr>
-          <w:rFonts w:ascii="Consolas" w:hAnsi="Consolas"/>
-          <w:sz w:val="19"/>
-        </w:rPr>
-        <w:t>RequestCost</w:t>
-      </w:r>
-      <w:r>
-        <w:t xml:space="preserve"> / </w:t>
-      </w:r>
-      <w:r>
-        <w:rPr>
-          <w:rFonts w:ascii="Consolas" w:hAnsi="Consolas"/>
-          <w:sz w:val="19"/>
-        </w:rPr>
-        <w:t>AuditLog</w:t>
-      </w:r>
-      <w:r>
-        <w:t xml:space="preserve"> / </w:t>
-      </w:r>
-      <w:r>
-        <w:rPr>
-          <w:rFonts w:ascii="Consolas" w:hAnsi="Consolas"/>
-          <w:sz w:val="19"/>
-        </w:rPr>
-        <w:t>RouteExecution</w:t>
-      </w:r>
-      <w:r>
-        <w:t xml:space="preserve"> writes happen in a </w:t>
-      </w:r>
-      <w:r>
-        <w:rPr>
-          <w:b/>
-        </w:rPr>
-        <w:t>background task after the client already has the response</w:t>
-      </w:r>
-      <w:r>
-        <w:t xml:space="preserve"> — the client is never blocked on bookkeeping.</w:t>
-      </w:r>
-    </w:p>
-    <w:p>
-      <w:pPr>
-        <w:pStyle w:val="ListBullet"/>
-      </w:pPr>
-      <w:r>
-        <w:t xml:space="preserve">The client receives the </w:t>
-      </w:r>
-      <w:r>
-        <w:rPr>
-          <w:b/>
-        </w:rPr>
-        <w:t>raw provider response body, verbatim</w:t>
-      </w:r>
-      <w:r>
-        <w:t xml:space="preserve">, plus an added </w:t>
-      </w:r>
-      <w:r>
-        <w:rPr>
-          <w:rFonts w:ascii="Consolas" w:hAnsi="Consolas"/>
-          <w:sz w:val="19"/>
-        </w:rPr>
-        <w:t>X-Request-Id</w:t>
-      </w:r>
-      <w:r>
-        <w:t xml:space="preserve"> header.</w:t>
-      </w:r>
-    </w:p>
-    <w:p>
-      <w:pPr>
-        <w:pStyle w:val="Heading3"/>
-      </w:pPr>
-      <w:r>
-        <w:t>Streaming (`/proxy/stream`)</w:t>
-      </w:r>
-    </w:p>
-    <w:p>
-      <w:r>
-        <w:t xml:space="preserve">Same pre-flight pipeline. Tokens are </w:t>
-      </w:r>
-      <w:r>
-        <w:rPr>
-          <w:b/>
-        </w:rPr>
-        <w:t>always</w:t>
-      </w:r>
-      <w:r>
-        <w:t xml:space="preserve"> tiktoken-estimated (Azure doesn't reliably report usage inside SSE chunks). DB writes happen synchronously at the end of the generator, not backgrounded. A stream that drops mid-way is recorded as </w:t>
-      </w:r>
-      <w:r>
-        <w:rPr>
-          <w:rFonts w:ascii="Consolas" w:hAnsi="Consolas"/>
-          <w:sz w:val="19"/>
-        </w:rPr>
-        <w:t>request_status="partial"</w:t>
-      </w:r>
-      <w:r>
-        <w:t xml:space="preserve">, </w:t>
-      </w:r>
-      <w:r>
-        <w:rPr>
-          <w:rFonts w:ascii="Consolas" w:hAnsi="Consolas"/>
-          <w:sz w:val="19"/>
-        </w:rPr>
-        <w:t>failure_code="stream_incomplete"</w:t>
-      </w:r>
-      <w:r>
-        <w:t>, and still bills whatever tokens were actually produced.</w:t>
-      </w:r>
-    </w:p>
-    <w:p>
-      <w:pPr>
-        <w:pStyle w:val="Heading2"/>
-      </w:pPr>
-      <w:r>
-        <w:t>4. Rate limiting (`rate_limit_service.py`)</w:t>
-      </w:r>
-    </w:p>
-    <w:p>
-      <w:pPr>
-        <w:pStyle w:val="ListBullet"/>
-      </w:pPr>
-      <w:r>
-        <w:t xml:space="preserve">Rows in </w:t>
-      </w:r>
-      <w:r>
-        <w:rPr>
-          <w:rFonts w:ascii="Consolas" w:hAnsi="Consolas"/>
-          <w:sz w:val="19"/>
-        </w:rPr>
-        <w:t>rate_limits</w:t>
-      </w:r>
-      <w:r>
-        <w:t xml:space="preserve"> can target a key, a project, or an org; </w:t>
-      </w:r>
-      <w:r>
-        <w:rPr>
-          <w:b/>
-        </w:rPr>
-        <w:t>all matching rows are evaluated</w:t>
-      </w:r>
-      <w:r>
-        <w:t>, and the first one exceeded blocks the request.</w:t>
-      </w:r>
-    </w:p>
-    <w:p>
-      <w:pPr>
-        <w:pStyle w:val="ListBullet"/>
-      </w:pPr>
-      <w:r>
-        <w:t xml:space="preserve">Two independent limit types per row: </w:t>
-      </w:r>
-      <w:r>
-        <w:rPr>
-          <w:rFonts w:ascii="Consolas" w:hAnsi="Consolas"/>
-          <w:sz w:val="19"/>
-        </w:rPr>
-        <w:t>max_requests_per_min</w:t>
-      </w:r>
-      <w:r>
-        <w:t xml:space="preserve"> and </w:t>
-      </w:r>
-      <w:r>
-        <w:rPr>
-          <w:rFonts w:ascii="Consolas" w:hAnsi="Consolas"/>
-          <w:sz w:val="19"/>
-        </w:rPr>
-        <w:t>max_tokens_per_day</w:t>
-      </w:r>
-      <w:r>
-        <w:t>.</w:t>
-      </w:r>
-    </w:p>
-    <w:p>
-      <w:pPr>
-        <w:pStyle w:val="ListBullet"/>
-      </w:pPr>
-      <w:r>
-        <w:rPr>
-          <w:b/>
-        </w:rPr>
-        <w:t>Requests/min</w:t>
-      </w:r>
-      <w:r>
-        <w:t xml:space="preserve"> uses a </w:t>
-      </w:r>
-      <w:r>
-        <w:rPr>
-          <w:b/>
-        </w:rPr>
-        <w:t>fixed 60-second window counter</w:t>
-      </w:r>
-      <w:r>
-        <w:t xml:space="preserve"> (bucketed by </w:t>
-      </w:r>
-      <w:r>
-        <w:rPr>
-          <w:rFonts w:ascii="Consolas" w:hAnsi="Consolas"/>
-          <w:sz w:val="19"/>
-        </w:rPr>
-        <w:t>time // 60</w:t>
-      </w:r>
-      <w:r>
-        <w:t>), stored in Redis (</w:t>
-      </w:r>
-      <w:r>
-        <w:rPr>
-          <w:rFonts w:ascii="Consolas" w:hAnsi="Consolas"/>
-          <w:sz w:val="19"/>
-        </w:rPr>
-        <w:t>INCR</w:t>
-      </w:r>
-      <w:r>
-        <w:t xml:space="preserve"> + </w:t>
-      </w:r>
-      <w:r>
-        <w:rPr>
-          <w:rFonts w:ascii="Consolas" w:hAnsi="Consolas"/>
-          <w:sz w:val="19"/>
-        </w:rPr>
-        <w:t>EXPIRE</w:t>
-      </w:r>
-      <w:r>
-        <w:t xml:space="preserve">), falling back to a Postgres count of recent </w:t>
-      </w:r>
-      <w:r>
-        <w:rPr>
-          <w:rFonts w:ascii="Consolas" w:hAnsi="Consolas"/>
-          <w:sz w:val="19"/>
-        </w:rPr>
-        <w:t>AiRequest</w:t>
-      </w:r>
-      <w:r>
-        <w:t xml:space="preserve"> rows if Redis is down.</w:t>
-      </w:r>
-    </w:p>
-    <w:p>
-      <w:pPr>
-        <w:pStyle w:val="ListBullet"/>
-      </w:pPr>
-      <w:r>
-        <w:rPr>
-          <w:b/>
-        </w:rPr>
-        <w:t>Tokens/day</w:t>
-      </w:r>
-      <w:r>
-        <w:t xml:space="preserve"> is incremented once per completed request (after the real cost/usage is known), stored in Redis per UTC calendar day, with a Postgres fallback.</w:t>
-      </w:r>
-    </w:p>
-    <w:p>
-      <w:pPr>
-        <w:pStyle w:val="ListBullet"/>
-      </w:pPr>
-      <w:r>
-        <w:t>At the pre-flight call site the model isn't known yet (</w:t>
-      </w:r>
-      <w:r>
-        <w:rPr>
-          <w:rFonts w:ascii="Consolas" w:hAnsi="Consolas"/>
-          <w:sz w:val="19"/>
-        </w:rPr>
-        <w:t>model=""</w:t>
-      </w:r>
-      <w:r>
-        <w:t xml:space="preserve">), so </w:t>
-      </w:r>
-      <w:r>
-        <w:rPr>
-          <w:b/>
-        </w:rPr>
-        <w:t>only rules with `tool_name` = `NULL`/`'*'` can actually match</w:t>
-      </w:r>
-      <w:r>
-        <w:t xml:space="preserve"> — per-model rate limits are effectively unenforceable at this stage.</w:t>
-      </w:r>
-    </w:p>
-    <w:p>
-      <w:pPr>
-        <w:pStyle w:val="ListBullet"/>
-      </w:pPr>
-      <w:r>
-        <w:t xml:space="preserve">Violation → </w:t>
-      </w:r>
-      <w:r>
-        <w:rPr>
-          <w:rFonts w:ascii="Consolas" w:hAnsi="Consolas"/>
-          <w:sz w:val="19"/>
-        </w:rPr>
-        <w:t>429</w:t>
-      </w:r>
-      <w:r>
-        <w:t xml:space="preserve"> with </w:t>
-      </w:r>
-      <w:r>
-        <w:rPr>
-          <w:rFonts w:ascii="Consolas" w:hAnsi="Consolas"/>
-          <w:sz w:val="19"/>
-        </w:rPr>
-        <w:t>Retry-After</w:t>
-      </w:r>
-      <w:r>
-        <w:t xml:space="preserve"> header and body </w:t>
-      </w:r>
-      <w:r>
-        <w:rPr>
-          <w:rFonts w:ascii="Consolas" w:hAnsi="Consolas"/>
-          <w:sz w:val="19"/>
-        </w:rPr>
-        <w:t>{"error":"rate_limit_exceeded","scope","limit_type","limit","current_count"/"tokens_used_today","retry_after","request_id"}</w:t>
-      </w:r>
-      <w:r>
-        <w:t>.</w:t>
-      </w:r>
-    </w:p>
-    <w:p>
-      <w:pPr>
-        <w:pStyle w:val="Heading2"/>
-      </w:pPr>
-      <w:r>
-        <w:t>5. Budget enforcement (`budget_service.py`)</w:t>
-      </w:r>
-    </w:p>
-    <w:p>
-      <w:pPr>
-        <w:pStyle w:val="ListBullet"/>
-      </w:pPr>
-      <w:r>
-        <w:t xml:space="preserve">"Spend" = </w:t>
-      </w:r>
-      <w:r>
-        <w:rPr>
-          <w:rFonts w:ascii="Consolas" w:hAnsi="Consolas"/>
-          <w:sz w:val="19"/>
-        </w:rPr>
-        <w:t>SUM(RequestCost.total_cost)</w:t>
-      </w:r>
-      <w:r>
-        <w:t xml:space="preserve"> for the current calendar month — i.e. actual computed cost of completed requests, not a live estimate.</w:t>
-      </w:r>
-    </w:p>
-    <w:p>
-      <w:pPr>
-        <w:pStyle w:val="ListBullet"/>
-      </w:pPr>
-      <w:r>
-        <w:t xml:space="preserve">Checked in order: </w:t>
-      </w:r>
-      <w:r>
-        <w:rPr>
-          <w:b/>
-        </w:rPr>
-        <w:t>project</w:t>
-      </w:r>
-      <w:r>
-        <w:t xml:space="preserve"> budget first (if one exists with a positive limit), then </w:t>
-      </w:r>
-      <w:r>
-        <w:rPr>
-          <w:b/>
-        </w:rPr>
-        <w:t>org</w:t>
-      </w:r>
-      <w:r>
-        <w:t xml:space="preserve"> budget.</w:t>
-      </w:r>
-    </w:p>
-    <w:p>
-      <w:pPr>
-        <w:pStyle w:val="ListBullet"/>
-      </w:pPr>
-      <w:r>
-        <w:rPr>
-          <w:rFonts w:ascii="Consolas" w:hAnsi="Consolas"/>
-          <w:sz w:val="19"/>
-        </w:rPr>
-        <w:t>ratio = spend / limit</w:t>
-      </w:r>
-      <w:r>
-        <w:t>:</w:t>
-      </w:r>
-    </w:p>
-    <w:p>
-      <w:pPr>
-        <w:pStyle w:val="ListBullet"/>
-      </w:pPr>
-      <w:r>
-        <w:rPr>
-          <w:rFonts w:ascii="Consolas" w:hAnsi="Consolas"/>
-          <w:sz w:val="19"/>
-        </w:rPr>
-        <w:t>ratio &gt;= 1.0</w:t>
-      </w:r>
-      <w:r>
-        <w:t xml:space="preserve"> → </w:t>
-      </w:r>
-      <w:r>
-        <w:rPr>
-          <w:b/>
-        </w:rPr>
-        <w:t>hard block</w:t>
-      </w:r>
-      <w:r>
-        <w:t xml:space="preserve">, </w:t>
-      </w:r>
-      <w:r>
-        <w:rPr>
-          <w:rFonts w:ascii="Consolas" w:hAnsi="Consolas"/>
-          <w:sz w:val="19"/>
-        </w:rPr>
-        <w:t>429</w:t>
-      </w:r>
-      <w:r>
-        <w:t xml:space="preserve">, audit + </w:t>
-      </w:r>
-      <w:r>
-        <w:rPr>
-          <w:rFonts w:ascii="Consolas" w:hAnsi="Consolas"/>
-          <w:sz w:val="19"/>
-        </w:rPr>
-        <w:t>critical</w:t>
-      </w:r>
-      <w:r>
-        <w:t xml:space="preserve"> alert.</w:t>
-      </w:r>
-    </w:p>
-    <w:p>
-      <w:pPr>
-        <w:pStyle w:val="ListBullet"/>
-      </w:pPr>
-      <w:r>
-        <w:rPr>
-          <w:rFonts w:ascii="Consolas" w:hAnsi="Consolas"/>
-          <w:sz w:val="19"/>
-        </w:rPr>
-        <w:t>ratio &gt;= alert_threshold_percent</w:t>
-      </w:r>
-      <w:r>
-        <w:t xml:space="preserve"> (default 80%) → </w:t>
-      </w:r>
-      <w:r>
-        <w:rPr>
-          <w:b/>
-        </w:rPr>
-        <w:t>warning only</w:t>
-      </w:r>
-      <w:r>
-        <w:t xml:space="preserve">, request proceeds, </w:t>
-      </w:r>
-      <w:r>
-        <w:rPr>
-          <w:rFonts w:ascii="Consolas" w:hAnsi="Consolas"/>
-          <w:sz w:val="19"/>
-        </w:rPr>
-        <w:t>high</w:t>
-      </w:r>
-      <w:r>
-        <w:t xml:space="preserve"> alert (existing active alert updated in place rather than duplicated).</w:t>
-      </w:r>
-    </w:p>
-    <w:p>
-      <w:pPr>
-        <w:pStyle w:val="ListBullet"/>
-      </w:pPr>
-      <w:r>
-        <w:t xml:space="preserve">Violation body: </w:t>
-      </w:r>
-      <w:r>
-        <w:rPr>
-          <w:rFonts w:ascii="Consolas" w:hAnsi="Consolas"/>
-          <w:sz w:val="19"/>
-        </w:rPr>
-        <w:t>{"error":"budget_exceeded","scope","budget_limit","current_spend","currency":"USD","request_id"}</w:t>
-      </w:r>
-      <w:r>
-        <w:t>.</w:t>
-      </w:r>
-    </w:p>
-    <w:p>
-      <w:pPr>
-        <w:pStyle w:val="Heading2"/>
-      </w:pPr>
-      <w:r>
-        <w:t>6. Model allow/block lists &amp; token ceilings — ⚠️ not currently enforced</w:t>
-      </w:r>
-    </w:p>
-    <w:p>
-      <w:r>
-        <w:rPr>
-          <w:rFonts w:ascii="Consolas" w:hAnsi="Consolas"/>
-          <w:sz w:val="19"/>
-        </w:rPr>
-        <w:t>governance_rule_service.py</w:t>
-      </w:r>
-      <w:r>
-        <w:t xml:space="preserve"> defines </w:t>
-      </w:r>
-      <w:r>
-        <w:rPr>
-          <w:rFonts w:ascii="Consolas" w:hAnsi="Consolas"/>
-          <w:sz w:val="19"/>
-        </w:rPr>
-        <w:t>check_governance_rules()</w:t>
-      </w:r>
-      <w:r>
-        <w:t xml:space="preserve"> (blocked-model / allowed-model / max-output-tokens) and </w:t>
-      </w:r>
-      <w:r>
-        <w:rPr>
-          <w:rFonts w:ascii="Consolas" w:hAnsi="Consolas"/>
-          <w:sz w:val="19"/>
-        </w:rPr>
-        <w:t>check_max_input_tokens()</w:t>
-      </w:r>
-      <w:r>
-        <w:t>, with a clear precedence: unknown pricing → block-list → allow-list → output-token ceiling, each writing an audit row and an alert on violation.</w:t>
-      </w:r>
-    </w:p>
-    <w:p>
-      <w:r>
-        <w:rPr>
-          <w:b/>
-        </w:rPr>
-        <w:t>However</w:t>
-      </w:r>
-      <w:r>
-        <w:t>, a repo-wide search confirms neither function is called anywhere outside its own definition:</w:t>
-      </w:r>
-    </w:p>
-    <w:p>
-      <w:pPr>
-        <w:spacing w:before="40" w:after="120"/>
-      </w:pPr>
-      <w:r>
-        <w:rPr>
-          <w:rFonts w:ascii="Consolas" w:hAnsi="Consolas"/>
-          <w:color w:val="333333"/>
-          <w:sz w:val="18"/>
-        </w:rPr>
-        <w:t>$ grep -rn "check_governance_rules\|check_max_input_tokens" app/</w:t>
-      </w:r>
-      <w:r>
-        <w:rPr>
-          <w:rFonts w:ascii="Consolas" w:hAnsi="Consolas"/>
-          <w:color w:val="333333"/>
-          <w:sz w:val="18"/>
-        </w:rPr>
-        <w:br/>
-        <w:t>app/services/governance_rule_service.py:37:def check_governance_rules(</w:t>
-      </w:r>
-      <w:r>
-        <w:rPr>
-          <w:rFonts w:ascii="Consolas" w:hAnsi="Consolas"/>
-          <w:color w:val="333333"/>
-          <w:sz w:val="18"/>
-        </w:rPr>
-        <w:br/>
-        <w:t>app/services/governance_rule_service.py:78:def check_max_input_tokens(</w:t>
-      </w:r>
-    </w:p>
-    <w:p>
-      <w:r>
-        <w:t xml:space="preserve">The logic is fully implemented and the </w:t>
-      </w:r>
-      <w:r>
-        <w:rPr>
-          <w:rFonts w:ascii="Consolas" w:hAnsi="Consolas"/>
-          <w:sz w:val="19"/>
-        </w:rPr>
-        <w:t>governance_rules</w:t>
-      </w:r>
-      <w:r>
-        <w:t xml:space="preserve"> table is populated/administered via its router, but it is </w:t>
-      </w:r>
-      <w:r>
-        <w:rPr>
-          <w:b/>
-        </w:rPr>
-        <w:t>not wired into `proxy.py`'s live request path</w:t>
-      </w:r>
-      <w:r>
-        <w:t>. Today, model allow/block lists and token ceilings have no effect on traffic. This is worth fixing or explicitly deprecating.</w:t>
-      </w:r>
-    </w:p>
-    <w:p>
-      <w:r>
-        <w:t xml:space="preserve">A second, related gap: </w:t>
-      </w:r>
-      <w:r>
-        <w:rPr>
-          <w:rFonts w:ascii="Consolas" w:hAnsi="Consolas"/>
-          <w:sz w:val="19"/>
-        </w:rPr>
-        <w:t>_load_rules()</w:t>
-      </w:r>
-      <w:r>
-        <w:t xml:space="preserve"> in the same module filters only </w:t>
-      </w:r>
-      <w:r>
-        <w:rPr>
-          <w:rFonts w:ascii="Consolas" w:hAnsi="Consolas"/>
-          <w:sz w:val="19"/>
-        </w:rPr>
-        <w:t>org_id</w:t>
-      </w:r>
-      <w:r>
-        <w:t xml:space="preserve">, never </w:t>
-      </w:r>
-      <w:r>
-        <w:rPr>
-          <w:rFonts w:ascii="Consolas" w:hAnsi="Consolas"/>
-          <w:sz w:val="19"/>
-        </w:rPr>
-        <w:t>project_id</w:t>
-      </w:r>
-      <w:r>
-        <w:t xml:space="preserve">, even though </w:t>
-      </w:r>
-      <w:r>
-        <w:rPr>
-          <w:rFonts w:ascii="Consolas" w:hAnsi="Consolas"/>
-          <w:sz w:val="19"/>
-        </w:rPr>
-        <w:t>GovernanceRule</w:t>
-      </w:r>
-      <w:r>
-        <w:t xml:space="preserve"> has a </w:t>
-      </w:r>
-      <w:r>
-        <w:rPr>
-          <w:rFonts w:ascii="Consolas" w:hAnsi="Consolas"/>
-          <w:sz w:val="19"/>
-        </w:rPr>
-        <w:t>project_id</w:t>
-      </w:r>
-      <w:r>
-        <w:t xml:space="preserve"> column — so even once wired in, rules would be org-wide only, not project-scoped as the schema implies.</w:t>
-      </w:r>
-    </w:p>
-    <w:p>
-      <w:pPr>
-        <w:pStyle w:val="Heading2"/>
-      </w:pPr>
-      <w:r>
-        <w:t>7. PII detection &amp; masking (`pii_engine.py`)</w:t>
-      </w:r>
-    </w:p>
-    <w:p>
-      <w:pPr>
-        <w:pStyle w:val="ListBullet"/>
-      </w:pPr>
-      <w:r>
-        <w:t>Engine: Microsoft Presidio (</w:t>
-      </w:r>
-      <w:r>
-        <w:rPr>
-          <w:rFonts w:ascii="Consolas" w:hAnsi="Consolas"/>
-          <w:sz w:val="19"/>
-        </w:rPr>
-        <w:t>AnalyzerEngine</w:t>
-      </w:r>
-      <w:r>
-        <w:t xml:space="preserve"> + spaCy </w:t>
-      </w:r>
-      <w:r>
-        <w:rPr>
-          <w:rFonts w:ascii="Consolas" w:hAnsi="Consolas"/>
-          <w:sz w:val="19"/>
-        </w:rPr>
-        <w:t>en_core_web_lg</w:t>
-      </w:r>
-      <w:r>
-        <w:t xml:space="preserve">) plus two custom regex recognizers for Indian </w:t>
-      </w:r>
-      <w:r>
-        <w:rPr>
-          <w:b/>
-        </w:rPr>
-        <w:t>Aadhaar</w:t>
-      </w:r>
-      <w:r>
-        <w:t xml:space="preserve"> and generic </w:t>
-      </w:r>
-      <w:r>
-        <w:rPr>
-          <w:b/>
-        </w:rPr>
-        <w:t>national ID / PAN</w:t>
-      </w:r>
-      <w:r>
-        <w:t>-style numbers.</w:t>
-      </w:r>
-    </w:p>
-    <w:p>
-      <w:pPr>
-        <w:pStyle w:val="ListBullet"/>
-      </w:pPr>
-      <w:r>
-        <w:t>Entities detected: email, phone, credit_card, ssn, ip_address, date_of_birth, name, location, national_id, passport, bank_account (IBAN), crypto, aadhar, organization, url.</w:t>
-      </w:r>
-    </w:p>
-    <w:p>
-      <w:pPr>
-        <w:pStyle w:val="ListBullet"/>
-      </w:pPr>
-      <w:r>
-        <w:t>Per-entity-type policy (</w:t>
-      </w:r>
-      <w:r>
-        <w:rPr>
-          <w:rFonts w:ascii="Consolas" w:hAnsi="Consolas"/>
-          <w:sz w:val="19"/>
-        </w:rPr>
-        <w:t>PiiPolicy</w:t>
-      </w:r>
-      <w:r>
-        <w:t xml:space="preserve"> table, org-specific rows override global defaults): </w:t>
-      </w:r>
-      <w:r>
-        <w:rPr>
-          <w:rFonts w:ascii="Consolas" w:hAnsi="Consolas"/>
-          <w:sz w:val="19"/>
-        </w:rPr>
-        <w:t>block</w:t>
-      </w:r>
-      <w:r>
-        <w:t xml:space="preserve"> (403), </w:t>
-      </w:r>
-      <w:r>
-        <w:rPr>
-          <w:rFonts w:ascii="Consolas" w:hAnsi="Consolas"/>
-          <w:sz w:val="19"/>
-        </w:rPr>
-        <w:t>mask</w:t>
-      </w:r>
-      <w:r>
-        <w:t xml:space="preserve"> (Presidio anonymizer replaces with </w:t>
-      </w:r>
-      <w:r>
-        <w:rPr>
-          <w:rFonts w:ascii="Consolas" w:hAnsi="Consolas"/>
-          <w:sz w:val="19"/>
-        </w:rPr>
-        <w:t>[EMAIL]</w:t>
-      </w:r>
-      <w:r>
-        <w:t xml:space="preserve">-style placeholder), </w:t>
-      </w:r>
-      <w:r>
-        <w:rPr>
-          <w:rFonts w:ascii="Consolas" w:hAnsi="Consolas"/>
-          <w:sz w:val="19"/>
-        </w:rPr>
-        <w:t>alert</w:t>
-      </w:r>
-      <w:r>
-        <w:t xml:space="preserve"> (logged only), </w:t>
-      </w:r>
-      <w:r>
-        <w:rPr>
-          <w:rFonts w:ascii="Consolas" w:hAnsi="Consolas"/>
-          <w:sz w:val="19"/>
-        </w:rPr>
-        <w:t>allow</w:t>
-      </w:r>
-      <w:r>
-        <w:t xml:space="preserve"> (untouched). Defaults: </w:t>
-      </w:r>
-      <w:r>
-        <w:rPr>
-          <w:rFonts w:ascii="Consolas" w:hAnsi="Consolas"/>
-          <w:sz w:val="19"/>
-        </w:rPr>
-        <w:t>location</w:t>
-      </w:r>
-      <w:r>
-        <w:t>/</w:t>
-      </w:r>
-      <w:r>
-        <w:rPr>
-          <w:rFonts w:ascii="Consolas" w:hAnsi="Consolas"/>
-          <w:sz w:val="19"/>
-        </w:rPr>
-        <w:t>organization</w:t>
-      </w:r>
-      <w:r>
-        <w:t>/</w:t>
-      </w:r>
-      <w:r>
-        <w:rPr>
-          <w:rFonts w:ascii="Consolas" w:hAnsi="Consolas"/>
-          <w:sz w:val="19"/>
-        </w:rPr>
-        <w:t>url</w:t>
-      </w:r>
-      <w:r>
-        <w:t xml:space="preserve"> → allow; everything else → mask.</w:t>
-      </w:r>
-    </w:p>
-    <w:p>
-      <w:pPr>
-        <w:pStyle w:val="ListBullet"/>
-      </w:pPr>
-      <w:r>
-        <w:rPr>
-          <w:b/>
-        </w:rPr>
-        <w:t>Severity</w:t>
-      </w:r>
-      <w:r>
-        <w:t xml:space="preserve"> (</w:t>
-      </w:r>
-      <w:r>
-        <w:rPr>
-          <w:rFonts w:ascii="Consolas" w:hAnsi="Consolas"/>
-          <w:sz w:val="19"/>
-        </w:rPr>
-        <w:t>compute_pii_severity</w:t>
-      </w:r>
-      <w:r>
-        <w:t xml:space="preserve">) — fixed by a recent commit that changed the signature from </w:t>
-      </w:r>
-      <w:r>
-        <w:rPr>
-          <w:rFonts w:ascii="Consolas" w:hAnsi="Consolas"/>
-          <w:sz w:val="19"/>
-        </w:rPr>
-        <w:t>(pii_types, total_count)</w:t>
-      </w:r>
-      <w:r>
-        <w:t xml:space="preserve"> to </w:t>
-      </w:r>
-      <w:r>
-        <w:rPr>
-          <w:rFonts w:ascii="Consolas" w:hAnsi="Consolas"/>
-          <w:sz w:val="19"/>
-        </w:rPr>
-        <w:t>(entity_types)</w:t>
-      </w:r>
-      <w:r>
-        <w:t>:</w:t>
-      </w:r>
-    </w:p>
-    <w:p>
-      <w:pPr>
-        <w:spacing w:before="40" w:after="120"/>
-      </w:pPr>
-      <w:r>
-        <w:rPr>
-          <w:rFonts w:ascii="Consolas" w:hAnsi="Consolas"/>
-          <w:color w:val="333333"/>
-          <w:sz w:val="18"/>
-        </w:rPr>
-        <w:t xml:space="preserve">  HIGH_SENSITIVITY = {aadhar, credit_card, passport, ssn, bank_account, national_id}</w:t>
-      </w:r>
-      <w:r>
-        <w:rPr>
-          <w:rFonts w:ascii="Consolas" w:hAnsi="Consolas"/>
-          <w:color w:val="333333"/>
-          <w:sz w:val="18"/>
-        </w:rPr>
-        <w:br/>
-        <w:t xml:space="preserve">  LOW_SENSITIVITY_DEFAULT_ALLOW = {location, organization, url}</w:t>
-      </w:r>
-      <w:r>
-        <w:rPr>
-          <w:rFonts w:ascii="Consolas" w:hAnsi="Consolas"/>
-          <w:color w:val="333333"/>
-          <w:sz w:val="18"/>
-        </w:rPr>
-        <w:br/>
-      </w:r>
-      <w:r>
-        <w:rPr>
-          <w:rFonts w:ascii="Consolas" w:hAnsi="Consolas"/>
-          <w:color w:val="333333"/>
-          <w:sz w:val="18"/>
-        </w:rPr>
-        <w:br/>
-        <w:t xml:space="preserve">  any high-sensitivity type present        → "high"</w:t>
-      </w:r>
-      <w:r>
-        <w:rPr>
-          <w:rFonts w:ascii="Consolas" w:hAnsi="Consolas"/>
-          <w:color w:val="333333"/>
-          <w:sz w:val="18"/>
-        </w:rPr>
-        <w:br/>
-        <w:t xml:space="preserve">  ≥5 "significant" (non-low) types present → "high"</w:t>
-      </w:r>
-      <w:r>
-        <w:rPr>
-          <w:rFonts w:ascii="Consolas" w:hAnsi="Consolas"/>
-          <w:color w:val="333333"/>
-          <w:sz w:val="18"/>
-        </w:rPr>
-        <w:br/>
-        <w:t xml:space="preserve">  ≥3 "significant" types present           → "medium"</w:t>
-      </w:r>
-      <w:r>
-        <w:rPr>
-          <w:rFonts w:ascii="Consolas" w:hAnsi="Consolas"/>
-          <w:color w:val="333333"/>
-          <w:sz w:val="18"/>
-        </w:rPr>
-        <w:br/>
-        <w:t xml:space="preserve">  otherwise                                 → "low"</w:t>
-      </w:r>
-    </w:p>
-    <w:p>
-      <w:r>
-        <w:t xml:space="preserve">Previously, severity escalated to </w:t>
-      </w:r>
-      <w:r>
-        <w:rPr>
-          <w:rFonts w:ascii="Consolas" w:hAnsi="Consolas"/>
-          <w:sz w:val="19"/>
-        </w:rPr>
-        <w:t>"high"</w:t>
-      </w:r>
-      <w:r>
-        <w:t xml:space="preserve"> once *any* 5 PII detections occurred, regardless of type — so repeated low-sensitivity hits (organization/location/url) wrongly pushed nearly every flagged request to High. Now only non-low-sensitivity entities count toward the volume thresholds, while a single occurrence of a genuinely sensitive type (SSN, credit card, Aadhaar, passport, bank account, national ID) still forces High immediately.</w:t>
-      </w:r>
-    </w:p>
-    <w:p>
-      <w:pPr>
-        <w:pStyle w:val="Heading2"/>
-      </w:pPr>
-      <w:r>
-        <w:t>8. Token counting (`token_counter.py`)</w:t>
-      </w:r>
-    </w:p>
-    <w:p>
-      <w:pPr>
-        <w:pStyle w:val="ListBullet"/>
-      </w:pPr>
-      <w:r>
-        <w:t xml:space="preserve">Uses </w:t>
-      </w:r>
-      <w:r>
-        <w:rPr>
-          <w:rFonts w:ascii="Consolas" w:hAnsi="Consolas"/>
-          <w:sz w:val="19"/>
-        </w:rPr>
-        <w:t>tiktoken</w:t>
-      </w:r>
-      <w:r>
-        <w:t xml:space="preserve">, resolving an encoding via </w:t>
-      </w:r>
-      <w:r>
-        <w:rPr>
-          <w:rFonts w:ascii="Consolas" w:hAnsi="Consolas"/>
-          <w:sz w:val="19"/>
-        </w:rPr>
-        <w:t>encoding_for_model()</w:t>
-      </w:r>
-      <w:r>
-        <w:t xml:space="preserve"> with prefix-based fallback (</w:t>
-      </w:r>
-      <w:r>
-        <w:rPr>
-          <w:rFonts w:ascii="Consolas" w:hAnsi="Consolas"/>
-          <w:sz w:val="19"/>
-        </w:rPr>
-        <w:t>gpt-4</w:t>
-      </w:r>
-      <w:r>
-        <w:t xml:space="preserve">, </w:t>
-      </w:r>
-      <w:r>
-        <w:rPr>
-          <w:rFonts w:ascii="Consolas" w:hAnsi="Consolas"/>
-          <w:sz w:val="19"/>
-        </w:rPr>
-        <w:t>gpt-3.5</w:t>
-      </w:r>
-      <w:r>
-        <w:t xml:space="preserve">, </w:t>
-      </w:r>
-      <w:r>
-        <w:rPr>
-          <w:rFonts w:ascii="Consolas" w:hAnsi="Consolas"/>
-          <w:sz w:val="19"/>
-        </w:rPr>
-        <w:t>text-embedding</w:t>
-      </w:r>
-      <w:r>
-        <w:t xml:space="preserve">, </w:t>
-      </w:r>
-      <w:r>
-        <w:rPr>
-          <w:rFonts w:ascii="Consolas" w:hAnsi="Consolas"/>
-          <w:sz w:val="19"/>
-        </w:rPr>
-        <w:t>claude</w:t>
-      </w:r>
-      <w:r>
-        <w:t xml:space="preserve">, </w:t>
-      </w:r>
-      <w:r>
-        <w:rPr>
-          <w:rFonts w:ascii="Consolas" w:hAnsi="Consolas"/>
-          <w:sz w:val="19"/>
-        </w:rPr>
-        <w:t>gemini</w:t>
-      </w:r>
-      <w:r>
-        <w:t xml:space="preserve">, </w:t>
-      </w:r>
-      <w:r>
-        <w:rPr>
-          <w:rFonts w:ascii="Consolas" w:hAnsi="Consolas"/>
-          <w:sz w:val="19"/>
-        </w:rPr>
-        <w:t>mistral</w:t>
-      </w:r>
-      <w:r>
-        <w:t xml:space="preserve">, </w:t>
-      </w:r>
-      <w:r>
-        <w:rPr>
-          <w:rFonts w:ascii="Consolas" w:hAnsi="Consolas"/>
-          <w:sz w:val="19"/>
-        </w:rPr>
-        <w:t>llama</w:t>
-      </w:r>
-      <w:r>
-        <w:t xml:space="preserve"> all map to </w:t>
-      </w:r>
-      <w:r>
-        <w:rPr>
-          <w:rFonts w:ascii="Consolas" w:hAnsi="Consolas"/>
-          <w:sz w:val="19"/>
-        </w:rPr>
-        <w:t>cl100k_base</w:t>
-      </w:r>
-      <w:r>
-        <w:t>).</w:t>
-      </w:r>
-    </w:p>
-    <w:p>
-      <w:pPr>
-        <w:pStyle w:val="ListBullet"/>
-      </w:pPr>
-      <w:r>
-        <w:rPr>
-          <w:b/>
-        </w:rPr>
-        <w:t>Non-streaming</w:t>
-      </w:r>
-      <w:r>
-        <w:t xml:space="preserve">: prefers the provider's own reported </w:t>
-      </w:r>
-      <w:r>
-        <w:rPr>
-          <w:rFonts w:ascii="Consolas" w:hAnsi="Consolas"/>
-          <w:sz w:val="19"/>
-        </w:rPr>
-        <w:t>usage.prompt_tokens</w:t>
-      </w:r>
-      <w:r>
-        <w:t>/</w:t>
-      </w:r>
-      <w:r>
-        <w:rPr>
-          <w:rFonts w:ascii="Consolas" w:hAnsi="Consolas"/>
-          <w:sz w:val="19"/>
-        </w:rPr>
-        <w:t>completion_tokens</w:t>
-      </w:r>
-      <w:r>
-        <w:t>; tiktoken is only a fallback when the provider omits usage.</w:t>
-      </w:r>
-    </w:p>
-    <w:p>
-      <w:pPr>
-        <w:pStyle w:val="ListBullet"/>
-      </w:pPr>
-      <w:r>
-        <w:rPr>
-          <w:b/>
-        </w:rPr>
-        <w:t>Streaming</w:t>
-      </w:r>
-      <w:r>
-        <w:t>: always tiktoken-estimated, both sides.</w:t>
-      </w:r>
-    </w:p>
-    <w:p>
-      <w:pPr>
-        <w:pStyle w:val="ListBullet"/>
-      </w:pPr>
-      <w:r>
-        <w:t>The source of each count is recorded (</w:t>
-      </w:r>
-      <w:r>
-        <w:rPr>
-          <w:rFonts w:ascii="Consolas" w:hAnsi="Consolas"/>
-          <w:sz w:val="19"/>
-        </w:rPr>
-        <w:t>TokenUsage.input_token_source</w:t>
-      </w:r>
-      <w:r>
-        <w:t>/</w:t>
-      </w:r>
-      <w:r>
-        <w:rPr>
-          <w:rFonts w:ascii="Consolas" w:hAnsi="Consolas"/>
-          <w:sz w:val="19"/>
-        </w:rPr>
-        <w:t>output_token_source</w:t>
-      </w:r>
-      <w:r>
-        <w:t xml:space="preserve"> = </w:t>
-      </w:r>
-      <w:r>
-        <w:rPr>
-          <w:rFonts w:ascii="Consolas" w:hAnsi="Consolas"/>
-          <w:sz w:val="19"/>
-        </w:rPr>
-        <w:t>"azure"</w:t>
-      </w:r>
-      <w:r>
-        <w:t xml:space="preserve"> or </w:t>
-      </w:r>
-      <w:r>
-        <w:rPr>
-          <w:rFonts w:ascii="Consolas" w:hAnsi="Consolas"/>
-          <w:sz w:val="19"/>
-        </w:rPr>
-        <w:t>"tiktoken_estimate"</w:t>
-      </w:r>
-      <w:r>
-        <w:t xml:space="preserve">), and </w:t>
-      </w:r>
-      <w:r>
-        <w:rPr>
-          <w:rFonts w:ascii="Consolas" w:hAnsi="Consolas"/>
-          <w:sz w:val="19"/>
-        </w:rPr>
-        <w:t>TokenUsage.is_estimated</w:t>
-      </w:r>
-      <w:r>
-        <w:t xml:space="preserve"> is set whenever either side isn't a real provider-reported count.</w:t>
-      </w:r>
-    </w:p>
-    <w:p>
-      <w:pPr>
-        <w:pStyle w:val="ListBullet"/>
-      </w:pPr>
-      <w:r>
-        <w:t xml:space="preserve">Vision/image tokens are estimated separately using OpenAI's official image-tiling formula when </w:t>
-      </w:r>
-      <w:r>
-        <w:rPr>
-          <w:rFonts w:ascii="Consolas" w:hAnsi="Consolas"/>
-          <w:sz w:val="19"/>
-        </w:rPr>
-        <w:t>image_url</w:t>
-      </w:r>
-      <w:r>
-        <w:t xml:space="preserve"> blocks are present.</w:t>
-      </w:r>
-    </w:p>
-    <w:p>
-      <w:pPr>
-        <w:pStyle w:val="Heading2"/>
-      </w:pPr>
-      <w:r>
-        <w:t>9. Cost calculation</w:t>
-      </w:r>
-    </w:p>
-    <w:p>
-      <w:r>
-        <w:t xml:space="preserve">Note: there are </w:t>
-      </w:r>
-      <w:r>
-        <w:rPr>
-          <w:b/>
-        </w:rPr>
-        <w:t>two independent cost-calculation code paths</w:t>
-      </w:r>
-      <w:r>
-        <w:t xml:space="preserve"> in this codebase:</w:t>
-      </w:r>
-    </w:p>
-    <w:p>
-      <w:pPr>
-        <w:pStyle w:val="ListBullet"/>
-      </w:pPr>
-      <w:r>
-        <w:rPr>
-          <w:b/>
-        </w:rPr>
-        <w:t>`proxy.py`'s own `_calculate_cost()`</w:t>
-      </w:r>
-      <w:r>
-        <w:t xml:space="preserve"> — used by the live proxy request path. Lookup order: DB </w:t>
-      </w:r>
-      <w:r>
-        <w:rPr>
-          <w:rFonts w:ascii="Consolas" w:hAnsi="Consolas"/>
-          <w:sz w:val="19"/>
-        </w:rPr>
-        <w:t>model_pricing</w:t>
-      </w:r>
-      <w:r>
-        <w:t xml:space="preserve"> row scoped to </w:t>
-      </w:r>
-      <w:r>
-        <w:rPr>
-          <w:rFonts w:ascii="Consolas" w:hAnsi="Consolas"/>
-          <w:sz w:val="19"/>
-        </w:rPr>
-        <w:t>(model_name, provider)</w:t>
-      </w:r>
-      <w:r>
-        <w:t xml:space="preserve"> → DB row scoped to </w:t>
-      </w:r>
-      <w:r>
-        <w:rPr>
-          <w:rFonts w:ascii="Consolas" w:hAnsi="Consolas"/>
-          <w:sz w:val="19"/>
-        </w:rPr>
-        <w:t>model_name</w:t>
-      </w:r>
-      <w:r>
-        <w:t xml:space="preserve"> only → static </w:t>
-      </w:r>
-      <w:r>
-        <w:rPr>
-          <w:rFonts w:ascii="Consolas" w:hAnsi="Consolas"/>
-          <w:sz w:val="19"/>
-        </w:rPr>
-        <w:t>PROVIDER_PRICING</w:t>
-      </w:r>
-      <w:r>
-        <w:t xml:space="preserve"> dict → static </w:t>
-      </w:r>
-      <w:r>
-        <w:rPr>
-          <w:rFonts w:ascii="Consolas" w:hAnsi="Consolas"/>
-          <w:sz w:val="19"/>
-        </w:rPr>
-        <w:t>MODEL_PRICING</w:t>
-      </w:r>
-      <w:r>
-        <w:t xml:space="preserve"> catalogue (~35 models). If nothing matches, cost is recorded as </w:t>
-      </w:r>
-      <w:r>
-        <w:rPr>
-          <w:b/>
-        </w:rPr>
-        <w:t>$0</w:t>
-      </w:r>
-      <w:r>
-        <w:t xml:space="preserve"> with </w:t>
-      </w:r>
-      <w:r>
-        <w:rPr>
-          <w:rFonts w:ascii="Consolas" w:hAnsi="Consolas"/>
-          <w:sz w:val="19"/>
-        </w:rPr>
-        <w:t>cost_model_type="unknown"</w:t>
-      </w:r>
-      <w:r>
-        <w:t xml:space="preserve"> and a warning is logged.</w:t>
-      </w:r>
-    </w:p>
-    <w:p>
-      <w:pPr>
-        <w:pStyle w:val="ListBullet"/>
-      </w:pPr>
-      <w:r>
-        <w:rPr>
-          <w:b/>
-        </w:rPr>
-        <w:t>`cost_engine.py`'s `CostEngine`</w:t>
-      </w:r>
-      <w:r>
-        <w:t xml:space="preserve"> — used only by the separate telemetry/ingestion pipeline (</w:t>
-      </w:r>
-      <w:r>
-        <w:rPr>
-          <w:rFonts w:ascii="Consolas" w:hAnsi="Consolas"/>
-          <w:sz w:val="19"/>
-        </w:rPr>
-        <w:t>app/services/ingestion/</w:t>
-      </w:r>
-      <w:r>
-        <w:t xml:space="preserve">), not by </w:t>
-      </w:r>
-      <w:r>
-        <w:rPr>
-          <w:rFonts w:ascii="Consolas" w:hAnsi="Consolas"/>
-          <w:sz w:val="19"/>
-        </w:rPr>
-        <w:t>/proxy</w:t>
-      </w:r>
-      <w:r>
-        <w:t>. It has its own 3-tier lookup plus infra-cost (latency, data transfer) calculation.</w:t>
-      </w:r>
-    </w:p>
-    <w:p>
-      <w:r>
-        <w:t>These two paths can drift independently since they don't share pricing-resolution code; worth reconciling if pricing changes need to apply consistently to both the proxy and the ingestion pipeline.</w:t>
-      </w:r>
-    </w:p>
-    <w:p>
-      <w:r>
-        <w:t xml:space="preserve">Model name aliases (e.g. </w:t>
-      </w:r>
-      <w:r>
-        <w:rPr>
-          <w:rFonts w:ascii="Consolas" w:hAnsi="Consolas"/>
-          <w:sz w:val="19"/>
-        </w:rPr>
-        <w:t>gpt4o</w:t>
-      </w:r>
-      <w:r>
-        <w:t xml:space="preserve"> → </w:t>
-      </w:r>
-      <w:r>
-        <w:rPr>
-          <w:rFonts w:ascii="Consolas" w:hAnsi="Consolas"/>
-          <w:sz w:val="19"/>
-        </w:rPr>
-        <w:t>gpt-4o</w:t>
-      </w:r>
-      <w:r>
-        <w:t>) are normalized before lookup. All costs are stored to 6 decimal places (</w:t>
-      </w:r>
-      <w:r>
-        <w:rPr>
-          <w:rFonts w:ascii="Consolas" w:hAnsi="Consolas"/>
-          <w:sz w:val="19"/>
-        </w:rPr>
-        <w:t>Decimal("0.000001")</w:t>
-      </w:r>
-      <w:r>
-        <w:t>).</w:t>
-      </w:r>
-    </w:p>
-    <w:p>
-      <w:pPr>
-        <w:pStyle w:val="Heading2"/>
-      </w:pPr>
-      <w:r>
-        <w:t>10. Key tables written per request</w:t>
+        <w:t>2. Guardrails in Place Today</w:t>
       </w:r>
     </w:p>
     <w:tbl>
@@ -2726,7 +793,7 @@
               <w:rPr>
                 <w:b/>
               </w:rPr>
-              <w:t>Table</w:t>
+              <w:t>Guardrail</w:t>
             </w:r>
           </w:p>
         </w:tc>
@@ -2745,7 +812,7 @@
               <w:rPr>
                 <w:b/>
               </w:rPr>
-              <w:t>Written by</w:t>
+              <w:t>What it protects against</w:t>
             </w:r>
           </w:p>
         </w:tc>
@@ -2764,7 +831,7 @@
               <w:rPr>
                 <w:b/>
               </w:rPr>
-              <w:t>Contents</w:t>
+              <w:t>How it responds</w:t>
             </w:r>
           </w:p>
         </w:tc>
@@ -2777,11 +844,7 @@
           <w:p>
             <w:r/>
             <w:r>
-              <w:rPr>
-                <w:rFonts w:ascii="Consolas" w:hAnsi="Consolas"/>
-                <w:sz w:val="19"/>
-              </w:rPr>
-              <w:t>ai_requests</w:t>
+              <w:t>Usage speed limits</w:t>
             </w:r>
           </w:p>
         </w:tc>
@@ -2792,7 +855,7 @@
           <w:p>
             <w:r/>
             <w:r>
-              <w:t>pre-flight, step 7</w:t>
+              <w:t>Runaway or accidental overuse by one team or credential</w:t>
             </w:r>
           </w:p>
         </w:tc>
@@ -2803,7 +866,7 @@
           <w:p>
             <w:r/>
             <w:r>
-              <w:t>request/response status, original + masked text, PII metadata, model/deployment</w:t>
+              <w:t>Automatically pauses further requests until the time window resets</w:t>
             </w:r>
           </w:p>
         </w:tc>
@@ -2816,11 +879,7 @@
           <w:p>
             <w:r/>
             <w:r>
-              <w:rPr>
-                <w:rFonts w:ascii="Consolas" w:hAnsi="Consolas"/>
-                <w:sz w:val="19"/>
-              </w:rPr>
-              <w:t>ai_responses</w:t>
+              <w:t>Monthly spending limits</w:t>
             </w:r>
           </w:p>
         </w:tc>
@@ -2831,7 +890,7 @@
           <w:p>
             <w:r/>
             <w:r>
-              <w:t>post-forward (background for non-stream)</w:t>
+              <w:t>Unexpected or uncontrolled AI bills</w:t>
             </w:r>
           </w:p>
         </w:tc>
@@ -2842,7 +901,7 @@
           <w:p>
             <w:r/>
             <w:r>
-              <w:t>raw response payload, tool calls, finish reason, latency</w:t>
+              <w:t>Warns as a project approaches its limit; blocks once the limit is reached</w:t>
             </w:r>
           </w:p>
         </w:tc>
@@ -2855,11 +914,7 @@
           <w:p>
             <w:r/>
             <w:r>
-              <w:rPr>
-                <w:rFonts w:ascii="Consolas" w:hAnsi="Consolas"/>
-                <w:sz w:val="19"/>
-              </w:rPr>
-              <w:t>token_usage</w:t>
+              <w:t>Sensitive-data protection</w:t>
             </w:r>
           </w:p>
         </w:tc>
@@ -2870,7 +925,7 @@
           <w:p>
             <w:r/>
             <w:r>
-              <w:t>post-forward</w:t>
+              <w:t>Personal or financial information being sent to, or stored by, an outside AI provider</w:t>
             </w:r>
           </w:p>
         </w:tc>
@@ -2881,183 +936,7 @@
           <w:p>
             <w:r/>
             <w:r>
-              <w:t>input/output/total tokens, source (</w:t>
-            </w:r>
-            <w:r>
-              <w:rPr>
-                <w:rFonts w:ascii="Consolas" w:hAnsi="Consolas"/>
-                <w:sz w:val="19"/>
-              </w:rPr>
-              <w:t>azure</w:t>
-            </w:r>
-            <w:r>
-              <w:t>/</w:t>
-            </w:r>
-            <w:r>
-              <w:rPr>
-                <w:rFonts w:ascii="Consolas" w:hAnsi="Consolas"/>
-                <w:sz w:val="19"/>
-              </w:rPr>
-              <w:t>tiktoken_estimate</w:t>
-            </w:r>
-            <w:r>
-              <w:t>)</w:t>
-            </w:r>
-          </w:p>
-        </w:tc>
-      </w:tr>
-      <w:tr>
-        <w:tc>
-          <w:tcPr>
-            <w:tcW w:type="dxa" w:w="2880"/>
-          </w:tcPr>
-          <w:p>
-            <w:r/>
-            <w:r>
-              <w:rPr>
-                <w:rFonts w:ascii="Consolas" w:hAnsi="Consolas"/>
-                <w:sz w:val="19"/>
-              </w:rPr>
-              <w:t>request_cost</w:t>
-            </w:r>
-          </w:p>
-        </w:tc>
-        <w:tc>
-          <w:tcPr>
-            <w:tcW w:type="dxa" w:w="2880"/>
-          </w:tcPr>
-          <w:p>
-            <w:r/>
-            <w:r>
-              <w:t>post-forward</w:t>
-            </w:r>
-          </w:p>
-        </w:tc>
-        <w:tc>
-          <w:tcPr>
-            <w:tcW w:type="dxa" w:w="2880"/>
-          </w:tcPr>
-          <w:p>
-            <w:r/>
-            <w:r>
-              <w:t>per-token costs, total cost, currency, pricing snapshot</w:t>
-            </w:r>
-          </w:p>
-        </w:tc>
-      </w:tr>
-      <w:tr>
-        <w:tc>
-          <w:tcPr>
-            <w:tcW w:type="dxa" w:w="2880"/>
-          </w:tcPr>
-          <w:p>
-            <w:r/>
-            <w:r>
-              <w:rPr>
-                <w:rFonts w:ascii="Consolas" w:hAnsi="Consolas"/>
-                <w:sz w:val="19"/>
-              </w:rPr>
-              <w:t>route_executions</w:t>
-            </w:r>
-          </w:p>
-        </w:tc>
-        <w:tc>
-          <w:tcPr>
-            <w:tcW w:type="dxa" w:w="2880"/>
-          </w:tcPr>
-          <w:p>
-            <w:r/>
-            <w:r>
-              <w:t>post-forward</w:t>
-            </w:r>
-          </w:p>
-        </w:tc>
-        <w:tc>
-          <w:tcPr>
-            <w:tcW w:type="dxa" w:w="2880"/>
-          </w:tcPr>
-          <w:p>
-            <w:r/>
-            <w:r>
-              <w:t>latency breakdown by pipeline phase</w:t>
-            </w:r>
-          </w:p>
-        </w:tc>
-      </w:tr>
-      <w:tr>
-        <w:tc>
-          <w:tcPr>
-            <w:tcW w:type="dxa" w:w="2880"/>
-          </w:tcPr>
-          <w:p>
-            <w:r/>
-            <w:r>
-              <w:rPr>
-                <w:rFonts w:ascii="Consolas" w:hAnsi="Consolas"/>
-                <w:sz w:val="19"/>
-              </w:rPr>
-              <w:t>audit_logs</w:t>
-            </w:r>
-          </w:p>
-        </w:tc>
-        <w:tc>
-          <w:tcPr>
-            <w:tcW w:type="dxa" w:w="2880"/>
-          </w:tcPr>
-          <w:p>
-            <w:r/>
-            <w:r>
-              <w:t>every enforcement decision</w:t>
-            </w:r>
-          </w:p>
-        </w:tc>
-        <w:tc>
-          <w:tcPr>
-            <w:tcW w:type="dxa" w:w="2880"/>
-          </w:tcPr>
-          <w:p>
-            <w:r/>
-            <w:r>
-              <w:t>category/action/status, compliance flags, linked request</w:t>
-            </w:r>
-          </w:p>
-        </w:tc>
-      </w:tr>
-      <w:tr>
-        <w:tc>
-          <w:tcPr>
-            <w:tcW w:type="dxa" w:w="2880"/>
-          </w:tcPr>
-          <w:p>
-            <w:r/>
-            <w:r>
-              <w:rPr>
-                <w:rFonts w:ascii="Consolas" w:hAnsi="Consolas"/>
-                <w:sz w:val="19"/>
-              </w:rPr>
-              <w:t>alerts</w:t>
-            </w:r>
-          </w:p>
-        </w:tc>
-        <w:tc>
-          <w:tcPr>
-            <w:tcW w:type="dxa" w:w="2880"/>
-          </w:tcPr>
-          <w:p>
-            <w:r/>
-            <w:r>
-              <w:t>budget/governance violations</w:t>
-            </w:r>
-          </w:p>
-        </w:tc>
-        <w:tc>
-          <w:tcPr>
-            <w:tcW w:type="dxa" w:w="2880"/>
-          </w:tcPr>
-          <w:p>
-            <w:r/>
-            <w:r>
-              <w:t>type, severity, threshold vs actual, active/resolved/dismissed</w:t>
+              <w:t>Masks, blocks, flags, or allows the data, based on configurable policy per data type</w:t>
             </w:r>
           </w:p>
         </w:tc>
@@ -3068,138 +947,7 @@
         <w:pStyle w:val="Heading2"/>
       </w:pPr>
       <w:r>
-        <w:t>11. Background aggregation (`app/scheduler.py`)</w:t>
-      </w:r>
-    </w:p>
-    <w:p>
-      <w:r>
-        <w:t>Two in-process APScheduler jobs (</w:t>
-      </w:r>
-      <w:r>
-        <w:rPr>
-          <w:rFonts w:ascii="Consolas" w:hAnsi="Consolas"/>
-          <w:sz w:val="19"/>
-        </w:rPr>
-        <w:t>coalesce=True, max_instances=1</w:t>
-      </w:r>
-      <w:r>
-        <w:t>):</w:t>
-      </w:r>
-    </w:p>
-    <w:p>
-      <w:pPr>
-        <w:pStyle w:val="ListBullet"/>
-      </w:pPr>
-      <w:r>
-        <w:rPr>
-          <w:b/>
-        </w:rPr>
-        <w:t>Hourly</w:t>
-      </w:r>
-      <w:r>
-        <w:t xml:space="preserve"> — rebuilds </w:t>
-      </w:r>
-      <w:r>
-        <w:rPr>
-          <w:rFonts w:ascii="Consolas" w:hAnsi="Consolas"/>
-          <w:sz w:val="19"/>
-        </w:rPr>
-        <w:t>DailyOrgSummary</w:t>
-      </w:r>
-      <w:r>
-        <w:t xml:space="preserve"> for today from </w:t>
-      </w:r>
-      <w:r>
-        <w:rPr>
-          <w:rFonts w:ascii="Consolas" w:hAnsi="Consolas"/>
-          <w:sz w:val="19"/>
-        </w:rPr>
-        <w:t>RequestCost</w:t>
-      </w:r>
-      <w:r>
-        <w:t xml:space="preserve"> + </w:t>
-      </w:r>
-      <w:r>
-        <w:rPr>
-          <w:rFonts w:ascii="Consolas" w:hAnsi="Consolas"/>
-          <w:sz w:val="19"/>
-        </w:rPr>
-        <w:t>AiRequest</w:t>
-      </w:r>
-      <w:r>
-        <w:t>, then runs anomaly detection (</w:t>
-      </w:r>
-      <w:r>
-        <w:rPr>
-          <w:rFonts w:ascii="Consolas" w:hAnsi="Consolas"/>
-          <w:sz w:val="19"/>
-        </w:rPr>
-        <w:t>UsageAnomaly</w:t>
-      </w:r>
-      <w:r>
-        <w:t>) comparing today's metrics against a historical baseline.</w:t>
-      </w:r>
-    </w:p>
-    <w:p>
-      <w:pPr>
-        <w:pStyle w:val="ListBullet"/>
-      </w:pPr>
-      <w:r>
-        <w:rPr>
-          <w:b/>
-        </w:rPr>
-        <w:t>Every 24h</w:t>
-      </w:r>
-      <w:r>
-        <w:t xml:space="preserve"> — rebuilds </w:t>
-      </w:r>
-      <w:r>
-        <w:rPr>
-          <w:rFonts w:ascii="Consolas" w:hAnsi="Consolas"/>
-          <w:sz w:val="19"/>
-        </w:rPr>
-        <w:t>MonthlyOrgSummary</w:t>
-      </w:r>
-      <w:r>
-        <w:t xml:space="preserve"> from the current month's </w:t>
-      </w:r>
-      <w:r>
-        <w:rPr>
-          <w:rFonts w:ascii="Consolas" w:hAnsi="Consolas"/>
-          <w:sz w:val="19"/>
-        </w:rPr>
-        <w:t>DailyOrgSummary</w:t>
-      </w:r>
-      <w:r>
-        <w:t xml:space="preserve"> rows.</w:t>
-      </w:r>
-    </w:p>
-    <w:p>
-      <w:r>
-        <w:t xml:space="preserve">Both are idempotent (delete-then-reinsert for the current period) and can be manually re-triggered via </w:t>
-      </w:r>
-      <w:r>
-        <w:rPr>
-          <w:rFonts w:ascii="Consolas" w:hAnsi="Consolas"/>
-          <w:sz w:val="19"/>
-        </w:rPr>
-        <w:t>POST /summary/admin/rebuild-daily?days_back=N</w:t>
-      </w:r>
-      <w:r>
-        <w:t xml:space="preserve"> for backfill.</w:t>
-      </w:r>
-    </w:p>
-    <w:p>
-      <w:pPr>
-        <w:pStyle w:val="Heading2"/>
-      </w:pPr>
-      <w:r>
-        <w:t>12. Output surfaces (dashboards / admin APIs)</w:t>
-      </w:r>
-    </w:p>
-    <w:p>
-      <w:r>
-        <w:t>All dashboard data is read from the tables in §10 (live) or §11 (pre-aggregated, up to ~24h stale for monthly figures):</w:t>
+        <w:t>3. What Happens If Something Goes Wrong</w:t>
       </w:r>
     </w:p>
     <w:tbl>
@@ -3210,14 +958,13 @@
         <w:tblLook w:firstColumn="1" w:firstRow="1" w:lastColumn="0" w:lastRow="0" w:noHBand="0" w:noVBand="1" w:val="04A0"/>
       </w:tblPr>
       <w:tblGrid>
-        <w:gridCol w:w="2880"/>
-        <w:gridCol w:w="2880"/>
-        <w:gridCol w:w="2880"/>
+        <w:gridCol w:w="4320"/>
+        <w:gridCol w:w="4320"/>
       </w:tblGrid>
       <w:tr>
         <w:tc>
           <w:tcPr>
-            <w:tcW w:type="dxa" w:w="2880"/>
+            <w:tcW w:type="dxa" w:w="4320"/>
             <w:shd w:val="clear" w:color="auto" w:fill="D9E2F3"/>
           </w:tcPr>
           <w:p>
@@ -3230,13 +977,13 @@
               <w:rPr>
                 <w:b/>
               </w:rPr>
-              <w:t>Router</w:t>
+              <w:t>Situation</w:t>
             </w:r>
           </w:p>
         </w:tc>
         <w:tc>
           <w:tcPr>
-            <w:tcW w:type="dxa" w:w="2880"/>
+            <w:tcW w:type="dxa" w:w="4320"/>
             <w:shd w:val="clear" w:color="auto" w:fill="D9E2F3"/>
           </w:tcPr>
           <w:p>
@@ -3249,26 +996,7 @@
               <w:rPr>
                 <w:b/>
               </w:rPr>
-              <w:t>Key endpoints</w:t>
-            </w:r>
-          </w:p>
-        </w:tc>
-        <w:tc>
-          <w:tcPr>
-            <w:tcW w:type="dxa" w:w="2880"/>
-            <w:shd w:val="clear" w:color="auto" w:fill="D9E2F3"/>
-          </w:tcPr>
-          <w:p>
-            <w:r>
-              <w:rPr>
-                <w:b/>
-              </w:rPr>
-            </w:r>
-            <w:r>
-              <w:rPr>
-                <w:b/>
-              </w:rPr>
-              <w:t>Shape</w:t>
+              <w:t>What the requesting team experiences</w:t>
             </w:r>
           </w:p>
         </w:tc>
@@ -3276,69 +1004,23 @@
       <w:tr>
         <w:tc>
           <w:tcPr>
-            <w:tcW w:type="dxa" w:w="2880"/>
+            <w:tcW w:type="dxa" w:w="4320"/>
           </w:tcPr>
           <w:p>
             <w:r/>
             <w:r>
-              <w:rPr>
-                <w:rFonts w:ascii="Consolas" w:hAnsi="Consolas"/>
-                <w:sz w:val="19"/>
-              </w:rPr>
-              <w:t>audit_logs.py</w:t>
+              <w:t>Invalid or expired credential</w:t>
             </w:r>
           </w:p>
         </w:tc>
         <w:tc>
           <w:tcPr>
-            <w:tcW w:type="dxa" w:w="2880"/>
+            <w:tcW w:type="dxa" w:w="4320"/>
           </w:tcPr>
           <w:p>
             <w:r/>
             <w:r>
-              <w:rPr>
-                <w:rFonts w:ascii="Consolas" w:hAnsi="Consolas"/>
-                <w:sz w:val="19"/>
-              </w:rPr>
-              <w:t>GET /audit-logs</w:t>
-            </w:r>
-            <w:r>
-              <w:t xml:space="preserve">, </w:t>
-            </w:r>
-            <w:r>
-              <w:rPr>
-                <w:rFonts w:ascii="Consolas" w:hAnsi="Consolas"/>
-                <w:sz w:val="19"/>
-              </w:rPr>
-              <w:t>/audit-logs/pii</w:t>
-            </w:r>
-            <w:r>
-              <w:t xml:space="preserve"> (RBAC: admin/security_reviewer), </w:t>
-            </w:r>
-            <w:r>
-              <w:rPr>
-                <w:rFonts w:ascii="Consolas" w:hAnsi="Consolas"/>
-                <w:sz w:val="19"/>
-              </w:rPr>
-              <w:t>/audit-logs/summary</w:t>
-            </w:r>
-          </w:p>
-        </w:tc>
-        <w:tc>
-          <w:tcPr>
-            <w:tcW w:type="dxa" w:w="2880"/>
-          </w:tcPr>
-          <w:p>
-            <w:r/>
-            <w:r>
-              <w:rPr>
-                <w:rFonts w:ascii="Consolas" w:hAnsi="Consolas"/>
-                <w:sz w:val="19"/>
-              </w:rPr>
-              <w:t>{total, offset, items[]}</w:t>
-            </w:r>
-            <w:r>
-              <w:t xml:space="preserve"> of audit rows, or grouped counts</w:t>
+              <w:t>Access is denied immediately</w:t>
             </w:r>
           </w:p>
         </w:tc>
@@ -3346,102 +1028,23 @@
       <w:tr>
         <w:tc>
           <w:tcPr>
-            <w:tcW w:type="dxa" w:w="2880"/>
+            <w:tcW w:type="dxa" w:w="4320"/>
           </w:tcPr>
           <w:p>
             <w:r/>
             <w:r>
-              <w:rPr>
-                <w:rFonts w:ascii="Consolas" w:hAnsi="Consolas"/>
-                <w:sz w:val="19"/>
-              </w:rPr>
-              <w:t>costs.py</w:t>
+              <w:t>Sending requests too quickly</w:t>
             </w:r>
           </w:p>
         </w:tc>
         <w:tc>
           <w:tcPr>
-            <w:tcW w:type="dxa" w:w="2880"/>
+            <w:tcW w:type="dxa" w:w="4320"/>
           </w:tcPr>
           <w:p>
             <w:r/>
             <w:r>
-              <w:rPr>
-                <w:rFonts w:ascii="Consolas" w:hAnsi="Consolas"/>
-                <w:sz w:val="19"/>
-              </w:rPr>
-              <w:t>/costs/by-model</w:t>
-            </w:r>
-            <w:r>
-              <w:t xml:space="preserve">, </w:t>
-            </w:r>
-            <w:r>
-              <w:rPr>
-                <w:rFonts w:ascii="Consolas" w:hAnsi="Consolas"/>
-                <w:sz w:val="19"/>
-              </w:rPr>
-              <w:t>/by-project</w:t>
-            </w:r>
-            <w:r>
-              <w:t xml:space="preserve">, </w:t>
-            </w:r>
-            <w:r>
-              <w:rPr>
-                <w:rFonts w:ascii="Consolas" w:hAnsi="Consolas"/>
-                <w:sz w:val="19"/>
-              </w:rPr>
-              <w:t>/by-org</w:t>
-            </w:r>
-            <w:r>
-              <w:t xml:space="preserve">, </w:t>
-            </w:r>
-            <w:r>
-              <w:rPr>
-                <w:rFonts w:ascii="Consolas" w:hAnsi="Consolas"/>
-                <w:sz w:val="19"/>
-              </w:rPr>
-              <w:t>/trend/daily</w:t>
-            </w:r>
-            <w:r>
-              <w:t xml:space="preserve">, </w:t>
-            </w:r>
-            <w:r>
-              <w:rPr>
-                <w:rFonts w:ascii="Consolas" w:hAnsi="Consolas"/>
-                <w:sz w:val="19"/>
-              </w:rPr>
-              <w:t>/trend/monthly</w:t>
-            </w:r>
-            <w:r>
-              <w:t xml:space="preserve">, </w:t>
-            </w:r>
-            <w:r>
-              <w:rPr>
-                <w:rFonts w:ascii="Consolas" w:hAnsi="Consolas"/>
-                <w:sz w:val="19"/>
-              </w:rPr>
-              <w:t>/request/{id}</w:t>
-            </w:r>
-            <w:r>
-              <w:t xml:space="preserve">, </w:t>
-            </w:r>
-            <w:r>
-              <w:rPr>
-                <w:rFonts w:ascii="Consolas" w:hAnsi="Consolas"/>
-                <w:sz w:val="19"/>
-              </w:rPr>
-              <w:t>/summary</w:t>
-            </w:r>
-          </w:p>
-        </w:tc>
-        <w:tc>
-          <w:tcPr>
-            <w:tcW w:type="dxa" w:w="2880"/>
-          </w:tcPr>
-          <w:p>
-            <w:r/>
-            <w:r>
-              <w:t>Arrays/dicts of token &amp; cost totals</w:t>
+              <w:t>Asked to slow down; told when they can try again</w:t>
             </w:r>
           </w:p>
         </w:tc>
@@ -3449,119 +1052,23 @@
       <w:tr>
         <w:tc>
           <w:tcPr>
-            <w:tcW w:type="dxa" w:w="2880"/>
+            <w:tcW w:type="dxa" w:w="4320"/>
           </w:tcPr>
           <w:p>
             <w:r/>
             <w:r>
-              <w:rPr>
-                <w:rFonts w:ascii="Consolas" w:hAnsi="Consolas"/>
-                <w:sz w:val="19"/>
-              </w:rPr>
-              <w:t>summary.py</w:t>
+              <w:t>Malformed or incomplete request</w:t>
             </w:r>
           </w:p>
         </w:tc>
         <w:tc>
           <w:tcPr>
-            <w:tcW w:type="dxa" w:w="2880"/>
+            <w:tcW w:type="dxa" w:w="4320"/>
           </w:tcPr>
           <w:p>
             <w:r/>
             <w:r>
-              <w:rPr>
-                <w:rFonts w:ascii="Consolas" w:hAnsi="Consolas"/>
-                <w:sz w:val="19"/>
-              </w:rPr>
-              <w:t>/summary/today</w:t>
-            </w:r>
-            <w:r>
-              <w:t xml:space="preserve">, </w:t>
-            </w:r>
-            <w:r>
-              <w:rPr>
-                <w:rFonts w:ascii="Consolas" w:hAnsi="Consolas"/>
-                <w:sz w:val="19"/>
-              </w:rPr>
-              <w:t>/daily</w:t>
-            </w:r>
-            <w:r>
-              <w:t xml:space="preserve">, </w:t>
-            </w:r>
-            <w:r>
-              <w:rPr>
-                <w:rFonts w:ascii="Consolas" w:hAnsi="Consolas"/>
-                <w:sz w:val="19"/>
-              </w:rPr>
-              <w:t>/monthly</w:t>
-            </w:r>
-            <w:r>
-              <w:t xml:space="preserve">, </w:t>
-            </w:r>
-            <w:r>
-              <w:rPr>
-                <w:rFonts w:ascii="Consolas" w:hAnsi="Consolas"/>
-                <w:sz w:val="19"/>
-              </w:rPr>
-              <w:t>/trends</w:t>
-            </w:r>
-            <w:r>
-              <w:t xml:space="preserve">, </w:t>
-            </w:r>
-            <w:r>
-              <w:rPr>
-                <w:rFonts w:ascii="Consolas" w:hAnsi="Consolas"/>
-                <w:sz w:val="19"/>
-              </w:rPr>
-              <w:t>/overview</w:t>
-            </w:r>
-          </w:p>
-        </w:tc>
-        <w:tc>
-          <w:tcPr>
-            <w:tcW w:type="dxa" w:w="2880"/>
-          </w:tcPr>
-          <w:p>
-            <w:r/>
-            <w:r>
-              <w:t xml:space="preserve">Live or pre-aggregated dashboard totals; </w:t>
-            </w:r>
-            <w:r>
-              <w:rPr>
-                <w:rFonts w:ascii="Consolas" w:hAnsi="Consolas"/>
-                <w:sz w:val="19"/>
-              </w:rPr>
-              <w:t>/overview</w:t>
-            </w:r>
-            <w:r>
-              <w:t xml:space="preserve"> includes </w:t>
-            </w:r>
-            <w:r>
-              <w:rPr>
-                <w:rFonts w:ascii="Consolas" w:hAnsi="Consolas"/>
-                <w:sz w:val="19"/>
-              </w:rPr>
-              <w:t>active_alerts</w:t>
-            </w:r>
-            <w:r>
-              <w:t xml:space="preserve">, </w:t>
-            </w:r>
-            <w:r>
-              <w:rPr>
-                <w:rFonts w:ascii="Consolas" w:hAnsi="Consolas"/>
-                <w:sz w:val="19"/>
-              </w:rPr>
-              <w:t>rules_active</w:t>
-            </w:r>
-            <w:r>
-              <w:t xml:space="preserve">, </w:t>
-            </w:r>
-            <w:r>
-              <w:rPr>
-                <w:rFonts w:ascii="Consolas" w:hAnsi="Consolas"/>
-                <w:sz w:val="19"/>
-              </w:rPr>
-              <w:t>budgets_at_risk</w:t>
+              <w:t>Rejected, with an explanation of what was wrong</w:t>
             </w:r>
           </w:p>
         </w:tc>
@@ -3569,62 +1076,119 @@
       <w:tr>
         <w:tc>
           <w:tcPr>
-            <w:tcW w:type="dxa" w:w="2880"/>
+            <w:tcW w:type="dxa" w:w="4320"/>
           </w:tcPr>
           <w:p>
             <w:r/>
             <w:r>
-              <w:rPr>
-                <w:rFonts w:ascii="Consolas" w:hAnsi="Consolas"/>
-                <w:sz w:val="19"/>
-              </w:rPr>
-              <w:t>alerts.py</w:t>
+              <w:t>Requested AI model not configured for that team</w:t>
             </w:r>
           </w:p>
         </w:tc>
         <w:tc>
           <w:tcPr>
-            <w:tcW w:type="dxa" w:w="2880"/>
+            <w:tcW w:type="dxa" w:w="4320"/>
           </w:tcPr>
           <w:p>
             <w:r/>
             <w:r>
-              <w:rPr>
-                <w:rFonts w:ascii="Consolas" w:hAnsi="Consolas"/>
-                <w:sz w:val="19"/>
-              </w:rPr>
-              <w:t>GET /alerts/</w:t>
+              <w:t>Rejected; team is prompted to check their configuration</w:t>
             </w:r>
+          </w:p>
+        </w:tc>
+      </w:tr>
+      <w:tr>
+        <w:tc>
+          <w:tcPr>
+            <w:tcW w:type="dxa" w:w="4320"/>
+          </w:tcPr>
+          <w:p>
+            <w:r/>
             <w:r>
-              <w:t xml:space="preserve">, </w:t>
-            </w:r>
-            <w:r>
-              <w:rPr>
-                <w:rFonts w:ascii="Consolas" w:hAnsi="Consolas"/>
-                <w:sz w:val="19"/>
-              </w:rPr>
-              <w:t>PATCH /alerts/{id}/resolve|dismiss</w:t>
-            </w:r>
-            <w:r>
-              <w:t xml:space="preserve">, </w:t>
-            </w:r>
-            <w:r>
-              <w:rPr>
-                <w:rFonts w:ascii="Consolas" w:hAnsi="Consolas"/>
-                <w:sz w:val="19"/>
-              </w:rPr>
-              <w:t>/alerts/counts</w:t>
+              <w:t>Monthly budget exceeded</w:t>
             </w:r>
           </w:p>
         </w:tc>
         <w:tc>
           <w:tcPr>
-            <w:tcW w:type="dxa" w:w="2880"/>
+            <w:tcW w:type="dxa" w:w="4320"/>
           </w:tcPr>
           <w:p>
             <w:r/>
             <w:r>
-              <w:t>Enriched alert list/detail, severity counts</w:t>
+              <w:t>Blocked, with their current spend and limit shown</w:t>
+            </w:r>
+          </w:p>
+        </w:tc>
+      </w:tr>
+      <w:tr>
+        <w:tc>
+          <w:tcPr>
+            <w:tcW w:type="dxa" w:w="4320"/>
+          </w:tcPr>
+          <w:p>
+            <w:r/>
+            <w:r>
+              <w:t>Sensitive data detected and policy is "block"</w:t>
+            </w:r>
+          </w:p>
+        </w:tc>
+        <w:tc>
+          <w:tcPr>
+            <w:tcW w:type="dxa" w:w="4320"/>
+          </w:tcPr>
+          <w:p>
+            <w:r/>
+            <w:r>
+              <w:t>Request rejected outright; no data is sent to the outside AI provider</w:t>
+            </w:r>
+          </w:p>
+        </w:tc>
+      </w:tr>
+      <w:tr>
+        <w:tc>
+          <w:tcPr>
+            <w:tcW w:type="dxa" w:w="4320"/>
+          </w:tcPr>
+          <w:p>
+            <w:r/>
+            <w:r>
+              <w:t>AI provider temporarily overloaded</w:t>
+            </w:r>
+          </w:p>
+        </w:tc>
+        <w:tc>
+          <w:tcPr>
+            <w:tcW w:type="dxa" w:w="4320"/>
+          </w:tcPr>
+          <w:p>
+            <w:r/>
+            <w:r>
+              <w:t>Automatically retried behind the scenes, or the team is asked to try again shortly</w:t>
+            </w:r>
+          </w:p>
+        </w:tc>
+      </w:tr>
+      <w:tr>
+        <w:tc>
+          <w:tcPr>
+            <w:tcW w:type="dxa" w:w="4320"/>
+          </w:tcPr>
+          <w:p>
+            <w:r/>
+            <w:r>
+              <w:t>AI provider completely unreachable</w:t>
+            </w:r>
+          </w:p>
+        </w:tc>
+        <w:tc>
+          <w:tcPr>
+            <w:tcW w:type="dxa" w:w="4320"/>
+          </w:tcPr>
+          <w:p>
+            <w:r/>
+            <w:r>
+              <w:t>Request fails safely; no cost is incurred; the team is notified</w:t>
             </w:r>
           </w:p>
         </w:tc>
@@ -3635,563 +1199,118 @@
         <w:pStyle w:val="Heading2"/>
       </w:pPr>
       <w:r>
-        <w:t>13. Failure-response summary</w:t>
+        <w:t>4. Where the Information Goes</w:t>
       </w:r>
     </w:p>
-    <w:tbl>
-      <w:tblPr>
-        <w:tblStyle w:val="LightGrid-Accent1"/>
-        <w:tblW w:type="auto" w:w="0"/>
-        <w:jc w:val="center"/>
-        <w:tblLook w:firstColumn="1" w:firstRow="1" w:lastColumn="0" w:lastRow="0" w:noHBand="0" w:noVBand="1" w:val="04A0"/>
-      </w:tblPr>
-      <w:tblGrid>
-        <w:gridCol w:w="2880"/>
-        <w:gridCol w:w="2880"/>
-        <w:gridCol w:w="2880"/>
-      </w:tblGrid>
-      <w:tr>
-        <w:tc>
-          <w:tcPr>
-            <w:tcW w:type="dxa" w:w="2880"/>
-            <w:shd w:val="clear" w:color="auto" w:fill="D9E2F3"/>
-          </w:tcPr>
-          <w:p>
-            <w:r>
-              <w:rPr>
-                <w:b/>
-              </w:rPr>
-            </w:r>
-            <w:r>
-              <w:rPr>
-                <w:b/>
-              </w:rPr>
-              <w:t>Condition</w:t>
-            </w:r>
-          </w:p>
-        </w:tc>
-        <w:tc>
-          <w:tcPr>
-            <w:tcW w:type="dxa" w:w="2880"/>
-            <w:shd w:val="clear" w:color="auto" w:fill="D9E2F3"/>
-          </w:tcPr>
-          <w:p>
-            <w:r>
-              <w:rPr>
-                <w:b/>
-              </w:rPr>
-            </w:r>
-            <w:r>
-              <w:rPr>
-                <w:b/>
-              </w:rPr>
-              <w:t>Status</w:t>
-            </w:r>
-          </w:p>
-        </w:tc>
-        <w:tc>
-          <w:tcPr>
-            <w:tcW w:type="dxa" w:w="2880"/>
-            <w:shd w:val="clear" w:color="auto" w:fill="D9E2F3"/>
-          </w:tcPr>
-          <w:p>
-            <w:r>
-              <w:rPr>
-                <w:b/>
-              </w:rPr>
-            </w:r>
-            <w:r>
-              <w:rPr>
-                <w:b/>
-              </w:rPr>
-              <w:t>Body</w:t>
-            </w:r>
-          </w:p>
-        </w:tc>
-      </w:tr>
-      <w:tr>
-        <w:tc>
-          <w:tcPr>
-            <w:tcW w:type="dxa" w:w="2880"/>
-          </w:tcPr>
-          <w:p>
-            <w:r/>
-            <w:r>
-              <w:t>Invalid/expired governance key</w:t>
-            </w:r>
-          </w:p>
-        </w:tc>
-        <w:tc>
-          <w:tcPr>
-            <w:tcW w:type="dxa" w:w="2880"/>
-          </w:tcPr>
-          <w:p>
-            <w:r/>
-            <w:r>
-              <w:t>401</w:t>
-            </w:r>
-          </w:p>
-        </w:tc>
-        <w:tc>
-          <w:tcPr>
-            <w:tcW w:type="dxa" w:w="2880"/>
-          </w:tcPr>
-          <w:p>
-            <w:r/>
-            <w:r>
-              <w:t>plain string</w:t>
-            </w:r>
-          </w:p>
-        </w:tc>
-      </w:tr>
-      <w:tr>
-        <w:tc>
-          <w:tcPr>
-            <w:tcW w:type="dxa" w:w="2880"/>
-          </w:tcPr>
-          <w:p>
-            <w:r/>
-            <w:r>
-              <w:t>Rate limit exceeded</w:t>
-            </w:r>
-          </w:p>
-        </w:tc>
-        <w:tc>
-          <w:tcPr>
-            <w:tcW w:type="dxa" w:w="2880"/>
-          </w:tcPr>
-          <w:p>
-            <w:r/>
-            <w:r>
-              <w:t>429</w:t>
-            </w:r>
-          </w:p>
-        </w:tc>
-        <w:tc>
-          <w:tcPr>
-            <w:tcW w:type="dxa" w:w="2880"/>
-          </w:tcPr>
-          <w:p>
-            <w:r/>
-            <w:r>
-              <w:rPr>
-                <w:rFonts w:ascii="Consolas" w:hAnsi="Consolas"/>
-                <w:sz w:val="19"/>
-              </w:rPr>
-              <w:t>rate_limit_exceeded</w:t>
-            </w:r>
-            <w:r>
-              <w:t xml:space="preserve"> + scope/limit/retry_after</w:t>
-            </w:r>
-          </w:p>
-        </w:tc>
-      </w:tr>
-      <w:tr>
-        <w:tc>
-          <w:tcPr>
-            <w:tcW w:type="dxa" w:w="2880"/>
-          </w:tcPr>
-          <w:p>
-            <w:r/>
-            <w:r>
-              <w:t>Malformed body / missing model</w:t>
-            </w:r>
-          </w:p>
-        </w:tc>
-        <w:tc>
-          <w:tcPr>
-            <w:tcW w:type="dxa" w:w="2880"/>
-          </w:tcPr>
-          <w:p>
-            <w:r/>
-            <w:r>
-              <w:t>400</w:t>
-            </w:r>
-          </w:p>
-        </w:tc>
-        <w:tc>
-          <w:tcPr>
-            <w:tcW w:type="dxa" w:w="2880"/>
-          </w:tcPr>
-          <w:p>
-            <w:r/>
-            <w:r>
-              <w:t>plain string</w:t>
-            </w:r>
-          </w:p>
-        </w:tc>
-      </w:tr>
-      <w:tr>
-        <w:tc>
-          <w:tcPr>
-            <w:tcW w:type="dxa" w:w="2880"/>
-          </w:tcPr>
-          <w:p>
-            <w:r/>
-            <w:r>
-              <w:t>Model not configured for org/project</w:t>
-            </w:r>
-          </w:p>
-        </w:tc>
-        <w:tc>
-          <w:tcPr>
-            <w:tcW w:type="dxa" w:w="2880"/>
-          </w:tcPr>
-          <w:p>
-            <w:r/>
-            <w:r>
-              <w:t>404</w:t>
-            </w:r>
-          </w:p>
-        </w:tc>
-        <w:tc>
-          <w:tcPr>
-            <w:tcW w:type="dxa" w:w="2880"/>
-          </w:tcPr>
-          <w:p>
-            <w:r/>
-            <w:r>
-              <w:t>plain string</w:t>
-            </w:r>
-          </w:p>
-        </w:tc>
-      </w:tr>
-      <w:tr>
-        <w:tc>
-          <w:tcPr>
-            <w:tcW w:type="dxa" w:w="2880"/>
-          </w:tcPr>
-          <w:p>
-            <w:r/>
-            <w:r>
-              <w:t>Budget exceeded</w:t>
-            </w:r>
-          </w:p>
-        </w:tc>
-        <w:tc>
-          <w:tcPr>
-            <w:tcW w:type="dxa" w:w="2880"/>
-          </w:tcPr>
-          <w:p>
-            <w:r/>
-            <w:r>
-              <w:t>429</w:t>
-            </w:r>
-          </w:p>
-        </w:tc>
-        <w:tc>
-          <w:tcPr>
-            <w:tcW w:type="dxa" w:w="2880"/>
-          </w:tcPr>
-          <w:p>
-            <w:r/>
-            <w:r>
-              <w:rPr>
-                <w:rFonts w:ascii="Consolas" w:hAnsi="Consolas"/>
-                <w:sz w:val="19"/>
-              </w:rPr>
-              <w:t>budget_exceeded</w:t>
-            </w:r>
-            <w:r>
-              <w:t xml:space="preserve"> + scope/limit/current spend</w:t>
-            </w:r>
-          </w:p>
-        </w:tc>
-      </w:tr>
-      <w:tr>
-        <w:tc>
-          <w:tcPr>
-            <w:tcW w:type="dxa" w:w="2880"/>
-          </w:tcPr>
-          <w:p>
-            <w:r/>
-            <w:r>
-              <w:t>PII block</w:t>
-            </w:r>
-          </w:p>
-        </w:tc>
-        <w:tc>
-          <w:tcPr>
-            <w:tcW w:type="dxa" w:w="2880"/>
-          </w:tcPr>
-          <w:p>
-            <w:r/>
-            <w:r>
-              <w:t>403</w:t>
-            </w:r>
-          </w:p>
-        </w:tc>
-        <w:tc>
-          <w:tcPr>
-            <w:tcW w:type="dxa" w:w="2880"/>
-          </w:tcPr>
-          <w:p>
-            <w:r/>
-            <w:r>
-              <w:rPr>
-                <w:rFonts w:ascii="Consolas" w:hAnsi="Consolas"/>
-                <w:sz w:val="19"/>
-              </w:rPr>
-              <w:t>pii_block</w:t>
-            </w:r>
-            <w:r>
-              <w:t xml:space="preserve"> + entity types</w:t>
-            </w:r>
-          </w:p>
-        </w:tc>
-      </w:tr>
-      <w:tr>
-        <w:tc>
-          <w:tcPr>
-            <w:tcW w:type="dxa" w:w="2880"/>
-          </w:tcPr>
-          <w:p>
-            <w:r/>
-            <w:r>
-              <w:t>Upstream 429</w:t>
-            </w:r>
-          </w:p>
-        </w:tc>
-        <w:tc>
-          <w:tcPr>
-            <w:tcW w:type="dxa" w:w="2880"/>
-          </w:tcPr>
-          <w:p>
-            <w:r/>
-            <w:r>
-              <w:t>429</w:t>
-            </w:r>
-          </w:p>
-        </w:tc>
-        <w:tc>
-          <w:tcPr>
-            <w:tcW w:type="dxa" w:w="2880"/>
-          </w:tcPr>
-          <w:p>
-            <w:r/>
-            <w:r>
-              <w:t>provider's own error body</w:t>
-            </w:r>
-          </w:p>
-        </w:tc>
-      </w:tr>
-      <w:tr>
-        <w:tc>
-          <w:tcPr>
-            <w:tcW w:type="dxa" w:w="2880"/>
-          </w:tcPr>
-          <w:p>
-            <w:r/>
-            <w:r>
-              <w:t>Upstream other error</w:t>
-            </w:r>
-          </w:p>
-        </w:tc>
-        <w:tc>
-          <w:tcPr>
-            <w:tcW w:type="dxa" w:w="2880"/>
-          </w:tcPr>
-          <w:p>
-            <w:r/>
-            <w:r>
-              <w:t>same as upstream</w:t>
-            </w:r>
-          </w:p>
-        </w:tc>
-        <w:tc>
-          <w:tcPr>
-            <w:tcW w:type="dxa" w:w="2880"/>
-          </w:tcPr>
-          <w:p>
-            <w:r/>
-            <w:r>
-              <w:t>provider's own error body</w:t>
-            </w:r>
-          </w:p>
-        </w:tc>
-      </w:tr>
-      <w:tr>
-        <w:tc>
-          <w:tcPr>
-            <w:tcW w:type="dxa" w:w="2880"/>
-          </w:tcPr>
-          <w:p>
-            <w:r/>
-            <w:r>
-              <w:t>Upstream unreachable</w:t>
-            </w:r>
-          </w:p>
-        </w:tc>
-        <w:tc>
-          <w:tcPr>
-            <w:tcW w:type="dxa" w:w="2880"/>
-          </w:tcPr>
-          <w:p>
-            <w:r/>
-            <w:r>
-              <w:t>502</w:t>
-            </w:r>
-          </w:p>
-        </w:tc>
-        <w:tc>
-          <w:tcPr>
-            <w:tcW w:type="dxa" w:w="2880"/>
-          </w:tcPr>
-          <w:p>
-            <w:r/>
-            <w:r>
-              <w:t>plain string</w:t>
-            </w:r>
-          </w:p>
-        </w:tc>
-      </w:tr>
-      <w:tr>
-        <w:tc>
-          <w:tcPr>
-            <w:tcW w:type="dxa" w:w="2880"/>
-          </w:tcPr>
-          <w:p>
-            <w:r/>
-            <w:r>
-              <w:t>Concurrency limiter full</w:t>
-            </w:r>
-          </w:p>
-        </w:tc>
-        <w:tc>
-          <w:tcPr>
-            <w:tcW w:type="dxa" w:w="2880"/>
-          </w:tcPr>
-          <w:p>
-            <w:r/>
-            <w:r>
-              <w:t>503</w:t>
-            </w:r>
-          </w:p>
-        </w:tc>
-        <w:tc>
-          <w:tcPr>
-            <w:tcW w:type="dxa" w:w="2880"/>
-          </w:tcPr>
-          <w:p>
-            <w:r/>
-            <w:r>
-              <w:t>plain string</w:t>
-            </w:r>
-          </w:p>
-        </w:tc>
-      </w:tr>
-      <w:tr>
-        <w:tc>
-          <w:tcPr>
-            <w:tcW w:type="dxa" w:w="2880"/>
-          </w:tcPr>
-          <w:p>
-            <w:r/>
-            <w:r>
-              <w:t>Circuit breaker open</w:t>
-            </w:r>
-          </w:p>
-        </w:tc>
-        <w:tc>
-          <w:tcPr>
-            <w:tcW w:type="dxa" w:w="2880"/>
-          </w:tcPr>
-          <w:p>
-            <w:r/>
-            <w:r>
-              <w:t>503</w:t>
-            </w:r>
-          </w:p>
-        </w:tc>
-        <w:tc>
-          <w:tcPr>
-            <w:tcW w:type="dxa" w:w="2880"/>
-          </w:tcPr>
-          <w:p>
-            <w:r/>
-            <w:r>
-              <w:t>plain string</w:t>
-            </w:r>
-          </w:p>
-        </w:tc>
-      </w:tr>
-    </w:tbl>
+    <w:p>
+      <w:r>
+        <w:t>Every check the platform performs, and every request that passes through it, feeds into reporting that different audiences can use without needing to involve IT:</w:t>
+      </w:r>
+    </w:p>
+    <w:p>
+      <w:pPr>
+        <w:pStyle w:val="ListBullet"/>
+      </w:pPr>
+      <w:r>
+        <w:t>Cost dashboards, broken down by AI model, by project, by organization, and by trend over time — so finance can see exactly where AI spend is going.</w:t>
+      </w:r>
+    </w:p>
+    <w:p>
+      <w:pPr>
+        <w:pStyle w:val="ListBullet"/>
+      </w:pPr>
+      <w:r>
+        <w:t>A complete audit trail of every decision the platform makes — what was allowed, what was blocked, and why — for compliance and security review.</w:t>
+      </w:r>
+    </w:p>
+    <w:p>
+      <w:pPr>
+        <w:pStyle w:val="ListBullet"/>
+      </w:pPr>
+      <w:r>
+        <w:t>Automatic alerts whenever a budget, usage limit, or sensitive-data policy is triggered, so the relevant team is notified without anyone needing to go looking for the problem.</w:t>
+      </w:r>
+    </w:p>
     <w:p>
       <w:pPr>
         <w:pStyle w:val="Heading2"/>
       </w:pPr>
       <w:r>
-        <w:t>14. Known gaps worth addressing</w:t>
+        <w:t>5. Automatic Reporting</w:t>
+      </w:r>
+    </w:p>
+    <w:p>
+      <w:r>
+        <w:t>Usage and cost figures are automatically rolled up into summaries every hour, and those in turn are rolled up into monthly figures every day — so leadership and finance always have current, ready-to-read numbers rather than needing someone to calculate them manually before a review.</w:t>
       </w:r>
     </w:p>
     <w:p>
       <w:pPr>
-        <w:pStyle w:val="ListNumber"/>
+        <w:pStyle w:val="Heading2"/>
+      </w:pPr>
+      <w:r>
+        <w:t>6. What's Built But Not Yet Switched On</w:t>
+      </w:r>
+    </w:p>
+    <w:p>
+      <w:r>
+        <w:t>Two things are worth flagging as decisions rather than problems — the underlying capability already exists, it simply hasn't been turned on or fully connected yet:</w:t>
+      </w:r>
+    </w:p>
+    <w:p>
+      <w:pPr>
+        <w:pStyle w:val="ListBullet"/>
       </w:pPr>
       <w:r>
         <w:rPr>
           <w:b/>
         </w:rPr>
-        <w:t>Model allow/block lists and token ceilings are implemented but not wired in</w:t>
+        <w:t>Model restriction rules.</w:t>
       </w:r>
       <w:r>
-        <w:t xml:space="preserve"> (§6) — currently have zero effect on live traffic.</w:t>
+        <w:t xml:space="preserve"> The ability to allow or block specific AI models, and to cap how long a response can be, has already been built — but it is not currently enforced on live traffic. Today, any team can use any configured model regardless of these rules. Turning this on (or formally deciding not to) is a small, low-risk piece of work.</w:t>
       </w:r>
     </w:p>
     <w:p>
       <w:pPr>
-        <w:pStyle w:val="ListNumber"/>
+        <w:pStyle w:val="ListBullet"/>
       </w:pPr>
       <w:r>
         <w:rPr>
           <w:b/>
         </w:rPr>
-        <w:t>`governance_rules` filtering ignores `project_id`</w:t>
+        <w:t>Project-level restriction.</w:t>
       </w:r>
       <w:r>
-        <w:t xml:space="preserve"> — even once wired in, rules would apply org-wide only.</w:t>
+        <w:t xml:space="preserve"> Even once the above is switched on, these restriction rules would currently apply organization-wide rather than to individual projects — worth deciding whether project-by-project control matters before enabling.</w:t>
       </w:r>
     </w:p>
     <w:p>
       <w:pPr>
-        <w:pStyle w:val="ListNumber"/>
+        <w:pStyle w:val="ListBullet"/>
       </w:pPr>
       <w:r>
         <w:rPr>
           <w:b/>
         </w:rPr>
-        <w:t>Two independent, divergent cost-calculation implementations</w:t>
+        <w:t>"Fail open" behavior on certain safety checks.</w:t>
       </w:r>
       <w:r>
-        <w:t xml:space="preserve"> (§9) — proxy path vs. ingestion/telemetry path.</w:t>
+        <w:t xml:space="preserve"> The speed-limit, budget, and sensitive-data checks are deliberately designed so that if one of them breaks due to an internal fault, the platform lets the request through rather than blocking legitimate business activity. This favors uptime over strict enforcement in that edge case — a reasonable trade-off, but it means a malfunctioning safety check could go unnoticed unless it's separately monitored.</w:t>
       </w:r>
     </w:p>
     <w:p>
       <w:pPr>
-        <w:pStyle w:val="ListNumber"/>
+        <w:pStyle w:val="ListBullet"/>
       </w:pPr>
       <w:r>
         <w:rPr>
           <w:b/>
         </w:rPr>
-        <w:t>Rate limiting, budget checks, and PII scanning all fail open</w:t>
+        <w:t>Two separate cost calculations.</w:t>
       </w:r>
       <w:r>
-        <w:t xml:space="preserve"> on unexpected exceptions (steps 2, 5, 6 in §2) — a bug in any of these services silently disables that control rather than blocking the request.</w:t>
-      </w:r>
-    </w:p>
-    <w:p>
-      <w:pPr>
-        <w:pStyle w:val="ListNumber"/>
-      </w:pPr>
-      <w:r>
-        <w:rPr>
-          <w:b/>
-        </w:rPr>
-        <w:t>Per-model rate limits can't match</w:t>
-      </w:r>
-      <w:r>
-        <w:t xml:space="preserve"> at the pre-flight call site since the model isn't resolved yet when the rate-limit check runs (§4).</w:t>
+        <w:t xml:space="preserve"> Costs are currently calculated in two different places — once for live requests, and once for a separate internal reporting pipeline. If AI provider pricing changes, both places need to be updated, or the two sets of numbers can drift apart. Worth reconciling into a single source of truth.</w:t>
       </w:r>
     </w:p>
     <w:p>
@@ -4204,12 +1323,12 @@
         <w:pStyle w:val="Heading1"/>
       </w:pPr>
       <w:r>
-        <w:t>Part 2 — Proposed Features (Real-Time Build Approaches)</w:t>
+        <w:t>Part 2 — Proposed Expansion</w:t>
       </w:r>
     </w:p>
     <w:p>
       <w:r>
-        <w:t>Living document. This part lists proposed new features on top of the platform described in Part 1, each with 4-5 concrete ways to build it — naming real tools, libraries, and approaches. Nothing here is committed; it defines the candidate scope for prioritization.</w:t>
+        <w:t>This part lays out proposed new capabilities on top of what Part 1 describes. Each one opens with a plain-English example of what it would look like in practice, followed by a short note on what building it would involve. Nothing here is a commitment — this is the candidate list for prioritization.</w:t>
       </w:r>
     </w:p>
     <w:p>
@@ -4217,17 +1336,12 @@
         <w:pStyle w:val="Heading2"/>
       </w:pPr>
       <w:r>
-        <w:t>2.0 Read This First: A Plain-English Scenario</w:t>
+        <w:t>2.0 A Simple Example to Follow Throughout</w:t>
       </w:r>
     </w:p>
     <w:p>
       <w:r>
-        <w:t>Every feature below reads more clearly against one running example than against six abstract ones. This section sets up a fictional company; each feature section that follows opens with an “In practice at Solstice” paragraph showing exactly what that company would see once the feature is live. The numbered technical options underneath are for the engineering team — the paragraph above them is what to hand to anyone else, including a manager or a client.</w:t>
-      </w:r>
-    </w:p>
-    <w:p>
-      <w:r>
-        <w:t>Solstice Retail Co. is a fictional mid-size retailer — about 600 employees — that has connected two internal tools to the AI Request Gateway described in Part 1:</w:t>
+        <w:t>Each feature below is easiest to picture against one running example, so here it is up front. Solstice Retail Co. is a fictional mid-size retailer — about 600 employees — that uses this platform for two internal tools:</w:t>
       </w:r>
     </w:p>
     <w:p>
@@ -4235,7 +1349,7 @@
         <w:pStyle w:val="ListBullet"/>
       </w:pPr>
       <w:r>
-        <w:t>Shopper Assist — a customer-facing chatbot on the website, handling roughly 50,000 conversations a month and answering shipping, billing, and returns questions using a premium AI model.</w:t>
+        <w:t>Shopper Assist — a customer-facing chatbot on the website, handling roughly 50,000 conversations a month, answering shipping, billing, and returns questions.</w:t>
       </w:r>
     </w:p>
     <w:p>
@@ -4243,12 +1357,12 @@
         <w:pStyle w:val="ListBullet"/>
       </w:pPr>
       <w:r>
-        <w:t>Compliance Review — an internal tool Legal and HR use to summarize supplier contracts and policy PDFs. Lower volume (about 2,000 requests a month), but each request attaches a long document, so it's expensive per call.</w:t>
+        <w:t>Compliance Review — an internal tool Legal and HR use to summarize supplier contracts and policy documents. Lower volume — about 2,000 requests a month — but each request attaches a long document, making it expensive per call.</w:t>
       </w:r>
     </w:p>
     <w:p>
       <w:r>
-        <w:t>One more wrinkle: Solstice's consulting arm resells a version of Shopper Assist to two outside retail clients. Their traffic runs through the same kind of gateway but must never mix with Solstice's own data or with each other's — a constraint that matters most in sections 2.4 and 2.5 below.</w:t>
+        <w:t>One more wrinkle: Solstice's consulting arm resells a version of Shopper Assist to two outside retail clients. Their traffic runs through the same platform but must never mix with Solstice's own data or with each other's — a constraint that matters most in sections 2.4 and 2.5 below.</w:t>
       </w:r>
     </w:p>
     <w:p>
@@ -4256,52 +1370,17 @@
         <w:pStyle w:val="Heading2"/>
       </w:pPr>
       <w:r>
-        <w:t>2.1 Per-Project / Per-User Token Analysis</w:t>
+        <w:t>2.1 Spend Visibility Down to the Individual Person</w:t>
       </w:r>
     </w:p>
     <w:p>
       <w:r>
-        <w:t>In practice at Solstice — Finance opens the dashboard and sees Compliance Review's AI spend jumped 300% in the past week — a jump big enough to alarm anyone, technical or not. Because usage is tracked down to the individual person, not just the project as a whole, drilling in shows the entire spike traces to one HR analyst who re-ran a 40-page supplier contract through the AI 60 times in an afternoon while testing different questions. IT reaches out to that one person instead of freezing AI access for all of Legal and HR — the issue is understood and resolved the same day, with a concrete name and a concrete number instead of a vague budget scare.</w:t>
+        <w:t>Finance opens the dashboard and sees Compliance Review's AI spend jumped 300% in the past week — a jump big enough to alarm anyone. Because usage would be tracked down to the individual person, not just the project as a whole, drilling in shows the entire spike traces to one HR analyst who re-ran a 40-page supplier contract through the AI 60 times in an afternoon while testing different questions. IT can reach out to that one person instead of freezing AI access for all of Legal and HR — the issue is understood and resolved the same day, with a concrete name and a concrete number instead of a vague budget scare.</w:t>
       </w:r>
     </w:p>
     <w:p>
-      <w:pPr>
-        <w:pStyle w:val="ListNumber"/>
-      </w:pPr>
       <w:r>
-        <w:t>Live counters in Redis — increment per-user/project token and cost counters the instant a request completes — sub-second dashboard updates.</w:t>
-      </w:r>
-    </w:p>
-    <w:p>
-      <w:pPr>
-        <w:pStyle w:val="ListNumber"/>
-      </w:pPr>
-      <w:r>
-        <w:t>Time-series database (TimescaleDB or InfluxDB) — for fast historical queries and percentile stats (p50/p90/p99) without extra custom code.</w:t>
-      </w:r>
-    </w:p>
-    <w:p>
-      <w:pPr>
-        <w:pStyle w:val="ListNumber"/>
-      </w:pPr>
-      <w:r>
-        <w:t>Message queue (Redis Streams or Kafka) + worker — decouples analytics updates from the request itself so tracking never slows down responses.</w:t>
-      </w:r>
-    </w:p>
-    <w:p>
-      <w:pPr>
-        <w:pStyle w:val="ListNumber"/>
-      </w:pPr>
-      <w:r>
-        <w:t>Off-the-shelf BI tool (Grafana or Metabase) — connected directly to the usage data for instant dashboards without building custom UI.</w:t>
-      </w:r>
-    </w:p>
-    <w:p>
-      <w:pPr>
-        <w:pStyle w:val="ListNumber"/>
-      </w:pPr>
-      <w:r>
-        <w:t>Rolling statistical check (z-score / EWMA) — flags unusual usage spikes per user in real time, no machine-learning infrastructure needed.</w:t>
+        <w:t>What it would take: live usage counters that update the moment a request completes, a way to query historical patterns quickly, and a dashboard that surfaces unusual spikes automatically rather than requiring someone to go looking for them.</w:t>
       </w:r>
     </w:p>
     <w:p>
@@ -4309,12 +1388,12 @@
         <w:pStyle w:val="Heading2"/>
       </w:pPr>
       <w:r>
-        <w:t>2.2 Optimization Tips Engine</w:t>
+        <w:t>2.2 Automatic Cost-Saving Recommendations</w:t>
       </w:r>
     </w:p>
     <w:p>
       <w:r>
-        <w:t>In practice at Solstice — the engine reviews a week of traffic and produces three tips, each one a plain sentence anyone can act on without opening a single line of code:</w:t>
+        <w:t>The system reviews a week of traffic and produces plain-sentence tips anyone can act on without reading a chart:</w:t>
       </w:r>
     </w:p>
     <w:p>
@@ -4322,7 +1401,7 @@
         <w:pStyle w:val="ListBullet"/>
       </w:pPr>
       <w:r>
-        <w:t>“Shopper Assist is using a $2.50-per-million-token model just to sort messages into Billing, Shipping, or Returns. A model built for simple tasks costs $0.15 per million tokens and does the same job for about 94% less.”</w:t>
+        <w:t>“Shopper Assist is using an expensive model just to sort messages into Billing, Shipping, or Returns. A model built for simple tasks does the same job for about 94% less.”</w:t>
       </w:r>
     </w:p>
     <w:p>
@@ -4330,7 +1409,7 @@
         <w:pStyle w:val="ListBullet"/>
       </w:pPr>
       <w:r>
-        <w:t>“Compliance Review re-sends the same 15,000-word supplier contract with every question asked about it. Turning on prompt caching lets the model reuse that document instead of re-reading it each time — roughly a 90% cut on that portion of the bill.”</w:t>
+        <w:t>“Compliance Review re-sends the same 15,000-word supplier contract with every question asked about it. Reusing that document instead of re-reading it each time would cut roughly 90% off that portion of the bill.”</w:t>
       </w:r>
     </w:p>
     <w:p>
@@ -4343,47 +1422,12 @@
     </w:p>
     <w:p>
       <w:r>
-        <w:t>Each tip names the project, the exact behavior, and the dollar impact — no chart-reading required.</w:t>
+        <w:t>Each tip would name the project, the exact behavior, and the dollar impact — no technical interpretation required.</w:t>
       </w:r>
     </w:p>
     <w:p>
-      <w:pPr>
-        <w:pStyle w:val="ListNumber"/>
-      </w:pPr>
       <w:r>
-        <w:t>Rule engine with plain if-then logic — e.g. "output far exceeds input tokens → suggest a response-length cap" — simple, explainable, fast to ship.</w:t>
-      </w:r>
-    </w:p>
-    <w:p>
-      <w:pPr>
-        <w:pStyle w:val="ListNumber"/>
-      </w:pPr>
-      <w:r>
-        <w:t>Model-substitution check — compare actual cost against a cheaper equivalent model using a maintained pricing table; surfaced as a daily summary.</w:t>
-      </w:r>
-    </w:p>
-    <w:p>
-      <w:pPr>
-        <w:pStyle w:val="ListNumber"/>
-      </w:pPr>
-      <w:r>
-        <w:t>Prompt-efficiency check using a tokenizer library — (e.g. OpenAI's tiktoken or a provider's native tokenizer) to flag oversized prompts.</w:t>
-      </w:r>
-    </w:p>
-    <w:p>
-      <w:pPr>
-        <w:pStyle w:val="ListNumber"/>
-      </w:pPr>
-      <w:r>
-        <w:t>Duplicate/cache-opportunity detection — hash prompts (SHA-256) or compare embeddings using a vector search tool (pgvector, Pinecone) to catch repeated calls that could be cached.</w:t>
-      </w:r>
-    </w:p>
-    <w:p>
-      <w:pPr>
-        <w:pStyle w:val="ListNumber"/>
-      </w:pPr>
-      <w:r>
-        <w:t>AI-generated plain-English tips — send aggregated, anonymized usage stats to a low-cost AI model on a schedule (not per-request) to write human-readable recommendations.</w:t>
+        <w:t>What it would take: simple rule-based checks comparing actual usage against cheaper equivalents and known inefficiency patterns, surfaced as a regular summary rather than a real-time interruption.</w:t>
       </w:r>
     </w:p>
     <w:p>
@@ -4391,12 +1435,12 @@
         <w:pStyle w:val="Heading2"/>
       </w:pPr>
       <w:r>
-        <w:t>2.3 Savings Counter</w:t>
+        <w:t>2.3 A Running Savings Total</w:t>
       </w:r>
     </w:p>
     <w:p>
       <w:r>
-        <w:t>In practice at Solstice — once the three tips from 2.2 are switched on, the counter tallies actual, confirmed savings — not a projection of what might happen, but what already did:</w:t>
+        <w:t>Once the recommendations from 2.2 are acted on, a savings tracker would tally actual, confirmed savings — not a projection of what might happen, but what already did:</w:t>
       </w:r>
     </w:p>
     <w:tbl>
@@ -4544,7 +1588,7 @@
           <w:p>
             <w:r/>
             <w:r>
-              <w:t>Turned on prompt caching for Compliance Review's supplier contract</w:t>
+              <w:t>Turned on document reuse for Compliance Review's supplier contract</w:t>
             </w:r>
           </w:p>
         </w:tc>
@@ -4671,47 +1715,12 @@
     </w:tbl>
     <w:p>
       <w:r>
-        <w:t>That $6.49 came from two small tweaks and one outage, on just two projects. At Solstice's actual scale — dozens of projects, not two — the same pattern realistically compounds into real annual savings, and the dashboard's running total is the number leadership sees the moment they open it, not a figure someone calculates for a quarterly review.</w:t>
+        <w:t>That $6.49 came from two small tweaks and one outage, on just two projects. At Solstice's actual scale — dozens of projects, not two — the same pattern realistically compounds into meaningful annual savings, and the running total would be the number leadership sees the moment they open the dashboard, not a figure someone calculates for a quarterly review.</w:t>
       </w:r>
     </w:p>
     <w:p>
-      <w:pPr>
-        <w:pStyle w:val="ListNumber"/>
-      </w:pPr>
       <w:r>
-        <w:t>Real-time running total in Redis — updated the instant a request's cost is known — live "$ saved this month" figure.</w:t>
-      </w:r>
-    </w:p>
-    <w:p>
-      <w:pPr>
-        <w:pStyle w:val="ListNumber"/>
-      </w:pPr>
-      <w:r>
-        <w:t>Baseline-vs-actual comparison — for every request, calculate what it would have cost on the most expensive comparable model and add the difference to the total.</w:t>
-      </w:r>
-    </w:p>
-    <w:p>
-      <w:pPr>
-        <w:pStyle w:val="ListNumber"/>
-      </w:pPr>
-      <w:r>
-        <w:t>Event-driven savings ledger — a message queue records each moment a cheaper pattern is adopted; a worker tallies confirmed (not projected) savings into a running ledger.</w:t>
-      </w:r>
-    </w:p>
-    <w:p>
-      <w:pPr>
-        <w:pStyle w:val="ListNumber"/>
-      </w:pPr>
-      <w:r>
-        <w:t>BI dashboard (Metabase/Grafana/Looker Studio) — pointed at the ledger for a shareable, always-current savings view.</w:t>
-      </w:r>
-    </w:p>
-    <w:p>
-      <w:pPr>
-        <w:pStyle w:val="ListNumber"/>
-      </w:pPr>
-      <w:r>
-        <w:t>Slack/Teams bot notifications — post savings milestones to a channel to drive visibility and adoption.</w:t>
+        <w:t>What it would take: a baseline-versus-actual comparison calculated for every request, tallied into a running, shareable total.</w:t>
       </w:r>
     </w:p>
     <w:p>
@@ -4719,52 +1728,17 @@
         <w:pStyle w:val="Heading2"/>
       </w:pPr>
       <w:r>
-        <w:t>2.4 Multi-Model Support (Claude / Gemini / OpenAI)</w:t>
+        <w:t>2.4 Support for Multiple AI Providers</w:t>
       </w:r>
     </w:p>
     <w:p>
       <w:r>
-        <w:t>In practice at Solstice — Shopper Assist's message-sorting step moves to a cheaper, faster model built for simple classification, while Compliance Review stays on a model with a large context window because it needs to read entire contracts in one pass. Both run through the same gateway, so both show up on the same dashboard, hit the same budget limits, and get scanned by the same sensitive-data checks — nobody on the finance or compliance team needs to know or care which company built which model. And because each of the two outside consulting clients gets its own isolated deployment with its own credentials, a pricing change or an outage at one AI provider never touches the other client's traffic.</w:t>
+        <w:t>Shopper Assist's message-sorting step could move to a cheaper, faster AI model built for simple classification, while Compliance Review stays on a model with a large enough capacity to read entire contracts in one pass — regardless of which company builds either model. Both would still show up on the same dashboard, hit the same budget limits, and get scanned by the same sensitive-data checks — nobody on the finance or compliance team needs to know or care which AI provider is behind either one. And because each outside consulting client would get their own isolated setup with its own credentials, a pricing change or an outage at one AI provider would never touch another client's traffic.</w:t>
       </w:r>
     </w:p>
     <w:p>
-      <w:pPr>
-        <w:pStyle w:val="ListNumber"/>
-      </w:pPr>
       <w:r>
-        <w:t>Official provider SDKs — (Anthropic, Google, OpenAI Python libraries) behind one common internal interface — swap providers without changing the rest of the system.</w:t>
-      </w:r>
-    </w:p>
-    <w:p>
-      <w:pPr>
-        <w:pStyle w:val="ListNumber"/>
-      </w:pPr>
-      <w:r>
-        <w:t>Shared, regularly-updated pricing table — sourced from each provider's public pricing, refreshed on a schedule.</w:t>
-      </w:r>
-    </w:p>
-    <w:p>
-      <w:pPr>
-        <w:pStyle w:val="ListNumber"/>
-      </w:pPr>
-      <w:r>
-        <w:t>Two onboarding speeds — full real-time routing through the gateway for tight control, or a simple usage-log upload/webhook for providers not yet fully integrated — faster to add new vendors.</w:t>
-      </w:r>
-    </w:p>
-    <w:p>
-      <w:pPr>
-        <w:pStyle w:val="ListNumber"/>
-      </w:pPr>
-      <w:r>
-        <w:t>Secrets manager — (HashiCorp Vault or a cloud provider's secrets service) to keep each provider's credentials isolated and never exposed to end users.</w:t>
-      </w:r>
-    </w:p>
-    <w:p>
-      <w:pPr>
-        <w:pStyle w:val="ListNumber"/>
-      </w:pPr>
-      <w:r>
-        <w:t>Common usage schema — (tokens, cost, latency) so dashboards and the savings counter work identically no matter which AI provider was used.</w:t>
+        <w:t>What it would take: a common internal interface that lets the platform work with any AI provider's underlying service without changing the rest of the system, plus a shared, regularly-updated view of what each provider charges.</w:t>
       </w:r>
     </w:p>
     <w:p>
@@ -4772,57 +1746,22 @@
         <w:pStyle w:val="Heading2"/>
       </w:pPr>
       <w:r>
-        <w:t>2.5 Licensed, Expiring Downloadable Package</w:t>
+        <w:t>2.5 Licensed, Time-Limited Software Packages</w:t>
       </w:r>
     </w:p>
     <w:p>
       <w:r>
-        <w:t>This is a distribution/licensing decision, not a governance feature — worth confirming this delivery model is actually needed before building.</w:t>
+        <w:t>This is a distribution and licensing decision, not a governance feature — worth confirming this delivery model is actually needed before building it.</w:t>
       </w:r>
     </w:p>
     <w:p>
       <w:r>
-        <w:t>In practice at Solstice's consulting arm — instead of hosting one shared copy of the platform for both outside clients (which would mean their data touches the same database and the same servers), each client gets its own copy of the packaged image installed inside their own environment, licensed for 12 months. Fifteen days before a license expires, the admin dashboard shows a renewal banner; if it lapses, AI traffic keeps flowing safely under the existing rules while the analytics dashboard freezes — an incentive to renew that never puts the client's day-to-day operations at risk.</w:t>
+        <w:t>For Solstice's consulting arm — instead of hosting one shared copy of the platform for both outside clients, which would mean their data touches the same systems, each client would get their own separate copy, licensed for 12 months. Fifteen days before a license expires, the dashboard would show a renewal reminder; if it lapses, AI traffic would keep flowing safely under the existing rules while the analytics dashboard pauses — an incentive to renew that never puts the client's day-to-day operations at risk.</w:t>
       </w:r>
     </w:p>
     <w:p>
-      <w:pPr>
-        <w:pStyle w:val="ListNumber"/>
-      </w:pPr>
       <w:r>
-        <w:t>Signed license file + standard container image — a signed token (JWT, via a library like PyJWT) carries expiry and enabled features; the app checks it at startup and periodically. Recommended — works fully offline, no ongoing dependency on your infrastructure.</w:t>
-      </w:r>
-    </w:p>
-    <w:p>
-      <w:pPr>
-        <w:pStyle w:val="ListNumber"/>
-      </w:pPr>
-      <w:r>
-        <w:t>Expiry built into the package at release time — simplest option, but every renewal requires shipping a new package.</w:t>
-      </w:r>
-    </w:p>
-    <w:p>
-      <w:pPr>
-        <w:pStyle w:val="ListNumber"/>
-      </w:pPr>
-      <w:r>
-        <w:t>Lightweight online license check — a small hosted validation endpoint the package calls periodically (with an offline grace period), enabling real-time revoke or extension.</w:t>
-      </w:r>
-    </w:p>
-    <w:p>
-      <w:pPr>
-        <w:pStyle w:val="ListNumber"/>
-      </w:pPr>
-      <w:r>
-        <w:t>Environment-locked license — tied to a machine or cluster identifier in addition to expiry, preventing the same package from running in unlicensed environments.</w:t>
-      </w:r>
-    </w:p>
-    <w:p>
-      <w:pPr>
-        <w:pStyle w:val="ListNumber"/>
-      </w:pPr>
-      <w:r>
-        <w:t>Virtual-machine image option — for customers needing full VM isolation instead of a container, with the license checked automatically on first boot.</w:t>
+        <w:t>What it would take: a signed, time-limited license bundled with each client's copy of the software, checked automatically on startup and periodically thereafter.</w:t>
       </w:r>
     </w:p>
     <w:p>
@@ -4830,52 +1769,17 @@
         <w:pStyle w:val="Heading2"/>
       </w:pPr>
       <w:r>
-        <w:t>2.6 Staying Expandable</w:t>
+        <w:t>2.6 Staying Easy to Expand</w:t>
       </w:r>
     </w:p>
     <w:p>
       <w:r>
-        <w:t>In practice at Solstice — six months after launch, one of the consulting arm's clients asks for a model from a provider that wasn't part of the original build. Because each provider is a self-contained add-on rather than something wired into the core system, support for the new provider ships as a plug-in module — existing clients on the older set of providers notice nothing, and nobody has to touch or retest the code the rest of Solstice already depends on.</w:t>
+        <w:t>Six months after launch, one of the consulting arm's clients asks for an AI provider that wasn't part of the original build. Because each provider would be a self-contained add-on rather than something built into the core of the system, support for the new provider could ship as an independent module — existing clients on the current set of providers would notice nothing, and nobody would need to touch or retest the parts of the system the rest of the business already depends on.</w:t>
       </w:r>
     </w:p>
     <w:p>
-      <w:pPr>
-        <w:pStyle w:val="ListNumber"/>
-      </w:pPr>
       <w:r>
-        <w:t>Plugin-style modules — new providers, rules, or checks are added as self-contained add-ons rather than changes to core logic.</w:t>
-      </w:r>
-    </w:p>
-    <w:p>
-      <w:pPr>
-        <w:pStyle w:val="ListNumber"/>
-      </w:pPr>
-      <w:r>
-        <w:t>Configuration-driven rules — stored in the database, so most changes don't require a new release.</w:t>
-      </w:r>
-    </w:p>
-    <w:p>
-      <w:pPr>
-        <w:pStyle w:val="ListNumber"/>
-      </w:pPr>
-      <w:r>
-        <w:t>Internal event notifications — new modules react to activity happening elsewhere in the system instead of being wired directly into it.</w:t>
-      </w:r>
-    </w:p>
-    <w:p>
-      <w:pPr>
-        <w:pStyle w:val="ListNumber"/>
-      </w:pPr>
-      <w:r>
-        <w:t>Feature flags tied to licensing — so expansion also becomes a natural packaging/upsell path.</w:t>
-      </w:r>
-    </w:p>
-    <w:p>
-      <w:pPr>
-        <w:pStyle w:val="ListNumber"/>
-      </w:pPr>
-      <w:r>
-        <w:t>New analytics features run in the background — never on the path of a live request, so growth never risks slowing down response times.</w:t>
+        <w:t>What it would take: keeping new providers, rules, and checks as add-ons rather than changes to the core system, and keeping configuration-driven rather than requiring a new release for every change.</w:t>
       </w:r>
     </w:p>
     <w:p>
@@ -4883,60 +1787,7 @@
         <w:pStyle w:val="Heading1"/>
       </w:pPr>
       <w:r>
-        <w:t>Template for Adding a New Feature</w:t>
-      </w:r>
-    </w:p>
-    <w:p>
-      <w:r>
-        <w:t>2.N  &lt;feature name&gt;</w:t>
-      </w:r>
-    </w:p>
-    <w:p>
-      <w:pPr>
-        <w:spacing w:before="40" w:after="120"/>
-      </w:pPr>
-      <w:r>
-        <w:rPr>
-          <w:rFonts w:ascii="Consolas" w:hAnsi="Consolas"/>
-          <w:color w:val="333333"/>
-          <w:sz w:val="18"/>
-        </w:rPr>
-        <w:t>1. &lt;approach — tool/library&gt; — &lt;why it fits&gt;</w:t>
-      </w:r>
-      <w:r>
-        <w:rPr>
-          <w:rFonts w:ascii="Consolas" w:hAnsi="Consolas"/>
-          <w:color w:val="333333"/>
-          <w:sz w:val="18"/>
-        </w:rPr>
-        <w:br/>
-        <w:t>2. ...</w:t>
-      </w:r>
-      <w:r>
-        <w:rPr>
-          <w:rFonts w:ascii="Consolas" w:hAnsi="Consolas"/>
-          <w:color w:val="333333"/>
-          <w:sz w:val="18"/>
-        </w:rPr>
-        <w:br/>
-        <w:t>3. ...</w:t>
-      </w:r>
-      <w:r>
-        <w:rPr>
-          <w:rFonts w:ascii="Consolas" w:hAnsi="Consolas"/>
-          <w:color w:val="333333"/>
-          <w:sz w:val="18"/>
-        </w:rPr>
-        <w:br/>
-        <w:t>4. ...</w:t>
-      </w:r>
-    </w:p>
-    <w:p>
-      <w:pPr>
-        <w:pStyle w:val="Heading1"/>
-      </w:pPr>
-      <w:r>
-        <w:t>Appendix: Plain-English Glossary</w:t>
+        <w:t>Appendix — Plain-English Glossary</w:t>
       </w:r>
     </w:p>
     <w:tbl>
@@ -5022,7 +1873,7 @@
           <w:p>
             <w:r/>
             <w:r>
-              <w:t>Proxy / Gateway</w:t>
+              <w:t>Checkpoint / Gateway</w:t>
             </w:r>
           </w:p>
         </w:tc>
@@ -5033,31 +1884,7 @@
           <w:p>
             <w:r/>
             <w:r>
-              <w:t>A checkpoint that every AI request passes through before reaching the AI provider, so the platform can inspect, log, and enforce rules on it — this is what Part 1 describes.</w:t>
-            </w:r>
-          </w:p>
-        </w:tc>
-      </w:tr>
-      <w:tr>
-        <w:tc>
-          <w:tcPr>
-            <w:tcW w:type="dxa" w:w="4320"/>
-          </w:tcPr>
-          <w:p>
-            <w:r/>
-            <w:r>
-              <w:t>API</w:t>
-            </w:r>
-          </w:p>
-        </w:tc>
-        <w:tc>
-          <w:tcPr>
-            <w:tcW w:type="dxa" w:w="4320"/>
-          </w:tcPr>
-          <w:p>
-            <w:r/>
-            <w:r>
-              <w:t>The way one piece of software (like this platform) talks to another (like OpenAI, Anthropic, or Google) over the internet.</w:t>
+              <w:t>The single point every AI request passes through before reaching the AI provider, so the platform can inspect, log, and enforce rules on it.</w:t>
             </w:r>
           </w:p>
         </w:tc>
@@ -5081,7 +1908,7 @@
           <w:p>
             <w:r/>
             <w:r>
-              <w:t>Personally Identifiable Information — things like names, emails, ID numbers, or financial details that need special handling to stay private.</w:t>
+              <w:t>Personally Identifiable Information — names, emails, ID numbers, or financial details that need special handling to stay private.</w:t>
             </w:r>
           </w:p>
         </w:tc>
@@ -5094,7 +1921,7 @@
           <w:p>
             <w:r/>
             <w:r>
-              <w:t>Prompt caching</w:t>
+              <w:t>Document reuse (prompt caching)</w:t>
             </w:r>
           </w:p>
         </w:tc>
@@ -5105,7 +1932,7 @@
           <w:p>
             <w:r/>
             <w:r>
-              <w:t>Letting an AI model reuse a document or instruction it has already seen instead of being sent it fresh every time — much cheaper for repeated content.</w:t>
+              <w:t>Letting an AI model reuse a document or instruction it has already seen instead of resending it fresh every time — much cheaper for repeated content.</w:t>
             </w:r>
           </w:p>
         </w:tc>
@@ -5118,7 +1945,7 @@
           <w:p>
             <w:r/>
             <w:r>
-              <w:t>Rate limiting</w:t>
+              <w:t>Usage speed limit (rate limiting)</w:t>
             </w:r>
           </w:p>
         </w:tc>
@@ -5129,7 +1956,7 @@
           <w:p>
             <w:r/>
             <w:r>
-              <w:t>A cap on how many requests or tokens a person or project can use in a given time window, to prevent runaway usage.</w:t>
+              <w:t>A cap on how many requests a person or project can make in a given time window, to prevent runaway usage.</w:t>
             </w:r>
           </w:p>
         </w:tc>
@@ -5153,7 +1980,7 @@
           <w:p>
             <w:r/>
             <w:r>
-              <w:t>Automatically warning or blocking further AI usage once a project or org crosses a spending limit for the month.</w:t>
+              <w:t>Automatically warning or blocking further AI usage once a project or organization crosses its spending limit for the month.</w:t>
             </w:r>
           </w:p>
         </w:tc>
@@ -5177,7 +2004,7 @@
           <w:p>
             <w:r/>
             <w:r>
-              <w:t>A time-limited permission file bundled with the software; when it lapses, certain features pause until it's renewed — the same idea as a software subscription.</w:t>
+              <w:t>A time-limited permission bundled with the software; when it lapses, certain features pause until it's renewed — the same idea as a software subscription.</w:t>
             </w:r>
           </w:p>
         </w:tc>
@@ -5190,7 +2017,7 @@
           <w:p>
             <w:r/>
             <w:r>
-              <w:t>Container image</w:t>
+              <w:t>Model / AI provider</w:t>
             </w:r>
           </w:p>
         </w:tc>
@@ -5201,31 +2028,7 @@
           <w:p>
             <w:r/>
             <w:r>
-              <w:t>A self-contained, ready-to-run package of the software and everything it needs, so it can be installed the same way in any environment.</w:t>
-            </w:r>
-          </w:p>
-        </w:tc>
-      </w:tr>
-      <w:tr>
-        <w:tc>
-          <w:tcPr>
-            <w:tcW w:type="dxa" w:w="4320"/>
-          </w:tcPr>
-          <w:p>
-            <w:r/>
-            <w:r>
-              <w:t>Model / LLM</w:t>
-            </w:r>
-          </w:p>
-        </w:tc>
-        <w:tc>
-          <w:tcPr>
-            <w:tcW w:type="dxa" w:w="4320"/>
-          </w:tcPr>
-          <w:p>
-            <w:r/>
-            <w:r>
-              <w:t>The underlying AI (e.g. GPT-4o, Claude, Gemini) that actually reads a request and writes a response; different models vary a lot in cost and capability.</w:t>
+              <w:t>The underlying AI service (for example, from OpenAI, Anthropic, or Google) that actually reads a request and writes a response; providers vary a lot in cost and capability.</w:t>
             </w:r>
           </w:p>
         </w:tc>
@@ -5630,7 +2433,7 @@
     <w:rsid w:val="00FC693F"/>
     <w:rPr>
       <w:rFonts w:ascii="Calibri" w:hAnsi="Calibri"/>
-      <w:sz w:val="21"/>
+      <w:sz w:val="22"/>
     </w:rPr>
   </w:style>
   <w:style w:type="paragraph" w:styleId="Header">

</xml_diff>